<commit_message>
Remove MAX30102/nhip tim/SpO2 khoi doandocs/*.docx
</commit_message>
<xml_diff>
--- a/doandocs/Chương 3.docx
+++ b/doandocs/Chương 3.docx
@@ -77,7 +77,7 @@
         <w:jc w:val="both"/>
       </w:pPr>
       <w:r>
-        <w:t>Node Xi là thiết bị cảm biến có nhiệm vụ tạo hoặc thu thập dữ liệu. Dữ liệu này có thể bao gồm nhiệt độ, độ ẩm, áp suất, nồng độ khí, nhịp tim, SpO2 và vị trí GPS. Sau khi tạo dữ liệu, node Xi đóng gói dữ liệu dưới dạng JSON, bổ sung sequence number, mã hóa bằng AES-128-CBC và gửi đến Gateway Y.</w:t>
+        <w:t>Node Xi là thiết bị cảm biến có nhiệm vụ tạo hoặc thu thập dữ liệu. Dữ liệu này có thể bao gồm nhiệt độ, độ ẩm, áp suất, nồng độ khívà vị trí GPS. Sau khi tạo dữ liệu, node Xi đóng gói dữ liệu dưới dạng JSON, bổ sung sequence number, mã hóa bằng AES-128-CBC và gửi đến Gateway Y.</w:t>
       </w:r>
     </w:p>
     <w:p>
@@ -1012,7 +1012,7 @@
               <w:rPr>
                 <w:sz w:val="20"/>
               </w:rPr>
-              <w:t>Tạo hoặc đọc dữ liệu nhiệt độ, độ ẩm, khí, nhịp tim, SpO2</w:t>
+              <w:t>Tạo hoặc đọc dữ liệu nhiệt độ, độ ẩm, khí</w:t>
             </w:r>
           </w:p>
         </w:tc>
@@ -5250,217 +5250,142 @@
         <w:keepLines/>
       </w:pPr>
       <w:r>
-        <w:lastRenderedPageBreak/>
         <w:t>┌───────────────────────────────────────────────┐</w:t>
-      </w:r>
-      <w:r>
         <w:br/>
-        <w:t>│                  Node Xi                      │</w:t>
-      </w:r>
-      <w:r>
+        <w:t>│ Node Xi │</w:t>
         <w:br/>
-        <w:t>│                                               │</w:t>
-      </w:r>
-      <w:r>
+        <w:t>│ │</w:t>
         <w:br/>
-        <w:t>│  - Tạo dữ liệu cảm biến                       │</w:t>
-      </w:r>
-      <w:r>
+        <w:t>│ - Tạo dữ liệu cảm biến │</w:t>
         <w:br/>
-        <w:t>│  - Tạo dữ liệu GPS                            │</w:t>
-      </w:r>
-      <w:r>
+        <w:t>│ - Tạo dữ liệu GPS │</w:t>
         <w:br/>
-        <w:t>│  - Tạo JSON                                   │</w:t>
-      </w:r>
-      <w:r>
+        <w:t>│ - Tạo JSON │</w:t>
         <w:br/>
-        <w:t>│  - Thêm sequence number                       │</w:t>
-      </w:r>
-      <w:r>
+        <w:t>│ - Thêm sequence number │</w:t>
         <w:br/>
-        <w:t>│  - Mã hóa AES-128-CBC                         │</w:t>
-      </w:r>
-      <w:r>
+        <w:t>│ - Mã hóa AES-128-CBC │</w:t>
         <w:br/>
-        <w:t>│  - Gửi payload mã hóa                         │</w:t>
-      </w:r>
-      <w:r>
+        <w:t>│ - Gửi payload mã hóa │</w:t>
         <w:br/>
-        <w:t>└──────────────────────┬────────────────────────┘</w:t>
-      </w:r>
-      <w:r>
-        <w:br/>
-        <w:t xml:space="preserve">                       │</w:t>
-      </w:r>
-      <w:r>
-        <w:br/>
-        <w:t xml:space="preserve">                       │ Beacon / ACK / Payload mã hóa</w:t>
-      </w:r>
-      <w:r>
-        <w:br/>
-        <w:t xml:space="preserve">                       │ LoRa hoặc mô phỏng LoRa</w:t>
-      </w:r>
-      <w:r>
-        <w:br/>
-        <w:t xml:space="preserve">                       ▼</w:t>
-      </w:r>
-      <w:r>
+        <w:t>└──────────────────────┬────────────────────────┘ │ │ Beacon / ACK / Payload mã hóa │ LoRa hoặc mô phỏng LoRa ▼</w:t>
         <w:br/>
         <w:t>┌───────────────────────────────────────────────┐</w:t>
-      </w:r>
-      <w:r>
         <w:br/>
-        <w:t>│                 Gateway Y                     │</w:t>
-      </w:r>
-      <w:r>
+        <w:t>│ Gateway Y │</w:t>
         <w:br/>
-        <w:t>│                                               │</w:t>
-      </w:r>
-      <w:r>
+        <w:t>│ │</w:t>
         <w:br/>
-        <w:t>│  - Nhận Beacon                                │</w:t>
-      </w:r>
-      <w:r>
+        <w:t>│ - Nhận Beacon │</w:t>
         <w:br/>
-        <w:t>│  - Gửi ACK                                    │</w:t>
-      </w:r>
-      <w:r>
+        <w:t>│ - Gửi ACK │</w:t>
         <w:br/>
-        <w:t>│  - Nhận payload mã hóa                        │</w:t>
-      </w:r>
-      <w:r>
+        <w:t>│ - Nhận payload mã hóa │</w:t>
         <w:br/>
-        <w:t>│  - Chuyển tiếp dữ liệu qua HTTP               │</w:t>
-      </w:r>
-      <w:r>
+        <w:t>│ - Chuyển tiếp dữ liệu qua HTTP │</w:t>
         <w:br/>
-        <w:t>└──────────────────────┬────────────────────────┘</w:t>
-      </w:r>
-      <w:r>
-        <w:br/>
-        <w:t xml:space="preserve">                       │</w:t>
-      </w:r>
-      <w:r>
-        <w:br/>
-        <w:t xml:space="preserve">                       │ Wi-Fi + HTTP POST</w:t>
-      </w:r>
-      <w:r>
-        <w:br/>
-        <w:t xml:space="preserve">                       ▼</w:t>
-      </w:r>
-      <w:r>
+        <w:t>└──────────────────────┬────────────────────────┘ │ │ Wi-Fi + HTTP POST ▼</w:t>
         <w:br/>
         <w:t>┌───────────────────────────────────────────────┐</w:t>
-      </w:r>
-      <w:r>
         <w:br/>
-        <w:t>│                Flask Server                   │</w:t>
-      </w:r>
-      <w:r>
+        <w:t>│ Flask Server │</w:t>
         <w:br/>
-        <w:t>│                                               │</w:t>
-      </w:r>
-      <w:r>
+        <w:t>│ │</w:t>
         <w:br/>
-        <w:t>│  - Nhận payload                               │</w:t>
-      </w:r>
-      <w:r>
+        <w:t>│ - Nhận payload │</w:t>
         <w:br/>
-        <w:t>│  - Tách IV và ciphertext                      │</w:t>
-      </w:r>
-      <w:r>
+        <w:t>│ - Tách IV và ciphertext │</w:t>
         <w:br/>
-        <w:t>│  - Giải mã AES-128-CBC                        │</w:t>
-      </w:r>
-      <w:r>
+        <w:t>│ - Giải mã AES-128-CBC │</w:t>
         <w:br/>
-        <w:t>│  - Kiểm tra sequence number                   │</w:t>
-      </w:r>
-      <w:r>
+        <w:t>│ - Kiểm tra sequence number │</w:t>
         <w:br/>
-        <w:t>│  - Lưu dữ liệu hợp lệ                         │</w:t>
-      </w:r>
-      <w:r>
+        <w:t>│ - Lưu dữ liệu hợp lệ │</w:t>
         <w:br/>
-        <w:t>└──────────────────────┬────────────────────────┘</w:t>
-      </w:r>
-      <w:r>
-        <w:br/>
-        <w:t xml:space="preserve">                       │</w:t>
-      </w:r>
-      <w:r>
-        <w:br/>
-        <w:t xml:space="preserve">                       ▼</w:t>
-      </w:r>
-      <w:r>
+        <w:t>└──────────────────────┬────────────────────────┘ │ ▼</w:t>
         <w:br/>
         <w:t>┌───────────────────────────────────────────────┐</w:t>
-      </w:r>
-      <w:r>
         <w:br/>
-        <w:t>│               SQLite Database                 │</w:t>
-      </w:r>
-      <w:r>
+        <w:t>│ SQLite Database │</w:t>
         <w:br/>
-        <w:t>│                                               │</w:t>
-      </w:r>
-      <w:r>
+        <w:t>│ │</w:t>
         <w:br/>
-        <w:t>│  - Lưu devices                                │</w:t>
-      </w:r>
-      <w:r>
+        <w:t>│ - Lưu devices │</w:t>
         <w:br/>
-        <w:t>│  - Lưu telemetry                              │</w:t>
-      </w:r>
-      <w:r>
+        <w:t>│ - Lưu telemetry │</w:t>
         <w:br/>
-        <w:t>│  - Lưu benchmark                              │</w:t>
-      </w:r>
-      <w:r>
+        <w:t>│ - Lưu benchmark │</w:t>
         <w:br/>
-        <w:t>└──────────────────────┬────────────────────────┘</w:t>
-      </w:r>
-      <w:r>
-        <w:br/>
-        <w:t xml:space="preserve">                       │</w:t>
-      </w:r>
-      <w:r>
-        <w:br/>
-        <w:t xml:space="preserve">                       ▼</w:t>
-      </w:r>
-      <w:r>
+        <w:t>└──────────────────────┬────────────────────────┘ │ ▼</w:t>
         <w:br/>
         <w:t>┌───────────────────────────────────────────────┐</w:t>
-      </w:r>
-      <w:r>
         <w:br/>
-        <w:t>│             Streamlit Dashboard               │</w:t>
-      </w:r>
-      <w:r>
+        <w:t>│ Streamlit Dashboard │</w:t>
         <w:br/>
-        <w:t>│                                               │</w:t>
-      </w:r>
-      <w:r>
+        <w:t>│ │</w:t>
         <w:br/>
-        <w:t>│  - Hiển thị bảng dữ liệu                      │</w:t>
-      </w:r>
-      <w:r>
+        <w:t>│ - Hiển thị bảng dữ liệu │</w:t>
         <w:br/>
-        <w:t>│  - Hiển thị biểu đồ                           │</w:t>
-      </w:r>
-      <w:r>
+        <w:t>│ - Hiển thị biểu đồ │</w:t>
         <w:br/>
-        <w:t>│  - Hiển thị bản đồ                            │</w:t>
-      </w:r>
-      <w:r>
+        <w:t>│ - Hiển thị bản đồ │</w:t>
         <w:br/>
-        <w:t>│  - Hiển thị benchmark                         │</w:t>
-      </w:r>
-      <w:r>
+        <w:t>│ - Hiển thị benchmark │</w:t>
         <w:br/>
         <w:t>└───────────────────────────────────────────────┘</w:t>
       </w:r>
+      <w:r/>
+      <w:r/>
+      <w:r/>
+      <w:r/>
+      <w:r/>
+      <w:r/>
+      <w:r/>
+      <w:r/>
+      <w:r/>
+      <w:r/>
+      <w:r/>
+      <w:r/>
+      <w:r/>
+      <w:r/>
+      <w:r/>
+      <w:r/>
+      <w:r/>
+      <w:r/>
+      <w:r/>
+      <w:r/>
+      <w:r/>
+      <w:r/>
+      <w:r/>
+      <w:r/>
+      <w:r/>
+      <w:r/>
+      <w:r/>
+      <w:r/>
+      <w:r/>
+      <w:r/>
+      <w:r/>
+      <w:r/>
+      <w:r/>
+      <w:r/>
+      <w:r/>
+      <w:r/>
+      <w:r/>
+      <w:r/>
+      <w:r/>
+      <w:r/>
+      <w:r/>
+      <w:r/>
+      <w:r/>
+      <w:r/>
+      <w:r/>
+      <w:r/>
+      <w:r/>
+      <w:r/>
+      <w:r/>
+      <w:r/>
+      <w:r/>
+      <w:r/>
     </w:p>
     <w:p>
       <w:pPr>
@@ -6455,168 +6380,88 @@
         <w:keepLines/>
       </w:pPr>
       <w:r>
-        <w:t>Bắt đầu</w:t>
-      </w:r>
-      <w:r>
+        <w:t>Bắt đầu ↓</w:t>
         <w:br/>
-        <w:t xml:space="preserve">  ↓</w:t>
-      </w:r>
-      <w:r>
+        <w:t>Khởi tạo Serial, mã node, khóa AES và sequence number ↓</w:t>
         <w:br/>
-        <w:t>Khởi tạo Serial, mã node, khóa AES và sequence number</w:t>
-      </w:r>
-      <w:r>
+        <w:t>Tạo Beacon ↓</w:t>
         <w:br/>
-        <w:t xml:space="preserve">  ↓</w:t>
-      </w:r>
-      <w:r>
+        <w:t>Gửi Beacon đến Gateway ↓</w:t>
         <w:br/>
-        <w:t>Tạo Beacon</w:t>
-      </w:r>
-      <w:r>
+        <w:t>Chờ ACK ↓</w:t>
         <w:br/>
-        <w:t xml:space="preserve">  ↓</w:t>
-      </w:r>
-      <w:r>
+        <w:t>Nếu không nhận ACK → gửi lại Beacon sau một khoảng thời gian ↓</w:t>
         <w:br/>
-        <w:t>Gửi Beacon đến Gateway</w:t>
-      </w:r>
-      <w:r>
+        <w:t>Nếu nhận ACK → kiểm tra mã node và mã Gateway ↓</w:t>
         <w:br/>
-        <w:t xml:space="preserve">  ↓</w:t>
-      </w:r>
-      <w:r>
+        <w:t>Nếu ACK không hợp lệ → bỏ qua và tiếp tục chờ ↓</w:t>
         <w:br/>
-        <w:t>Chờ ACK</w:t>
-      </w:r>
-      <w:r>
+        <w:t>Nếu ACK hợp lệ → tạo dữ liệu cảm biến ↓</w:t>
         <w:br/>
-        <w:t xml:space="preserve">  ↓</w:t>
-      </w:r>
-      <w:r>
+        <w:t>Tạo dữ liệu GPS ↓</w:t>
         <w:br/>
-        <w:t>Nếu không nhận ACK → gửi lại Beacon sau một khoảng thời gian</w:t>
-      </w:r>
-      <w:r>
+        <w:t>Đóng gói dữ liệu JSON ↓</w:t>
         <w:br/>
-        <w:t xml:space="preserve">  ↓</w:t>
-      </w:r>
-      <w:r>
+        <w:t>Thêm sequence number ↓</w:t>
         <w:br/>
-        <w:t>Nếu nhận ACK → kiểm tra mã node và mã Gateway</w:t>
-      </w:r>
-      <w:r>
+        <w:t>Chuyển JSON thành byte ↓</w:t>
         <w:br/>
-        <w:t xml:space="preserve">  ↓</w:t>
-      </w:r>
-      <w:r>
+        <w:t>Thêm padding ↓</w:t>
         <w:br/>
-        <w:t>Nếu ACK không hợp lệ → bỏ qua và tiếp tục chờ</w:t>
-      </w:r>
-      <w:r>
+        <w:t>Sinh IV 16 byte ↓</w:t>
         <w:br/>
-        <w:t xml:space="preserve">  ↓</w:t>
-      </w:r>
-      <w:r>
+        <w:t>Mã hóa AES-128-CBC ↓</w:t>
         <w:br/>
-        <w:t>Nếu ACK hợp lệ → tạo dữ liệu cảm biến</w:t>
-      </w:r>
-      <w:r>
+        <w:t>Ghép IV và ciphertext ↓</w:t>
         <w:br/>
-        <w:t xml:space="preserve">  ↓</w:t>
-      </w:r>
-      <w:r>
+        <w:t>Chuyển payload sang hex ↓</w:t>
         <w:br/>
-        <w:t>Tạo dữ liệu GPS</w:t>
-      </w:r>
-      <w:r>
+        <w:t>Gửi payload đến Gateway ↓</w:t>
         <w:br/>
-        <w:t xml:space="preserve">  ↓</w:t>
-      </w:r>
-      <w:r>
-        <w:br/>
-        <w:t>Đóng gói dữ liệu JSON</w:t>
-      </w:r>
-      <w:r>
-        <w:br/>
-        <w:t xml:space="preserve">  ↓</w:t>
-      </w:r>
-      <w:r>
-        <w:br/>
-        <w:t>Thêm sequence number</w:t>
-      </w:r>
-      <w:r>
-        <w:br/>
-        <w:t xml:space="preserve">  ↓</w:t>
-      </w:r>
-      <w:r>
-        <w:br/>
-        <w:t>Chuyển JSON thành byte</w:t>
-      </w:r>
-      <w:r>
-        <w:br/>
-        <w:t xml:space="preserve">  ↓</w:t>
-      </w:r>
-      <w:r>
-        <w:br/>
-        <w:t>Thêm padding</w:t>
-      </w:r>
-      <w:r>
-        <w:br/>
-        <w:t xml:space="preserve">  ↓</w:t>
-      </w:r>
-      <w:r>
-        <w:br/>
-        <w:t>Sinh IV 16 byte</w:t>
-      </w:r>
-      <w:r>
-        <w:br/>
-        <w:t xml:space="preserve">  ↓</w:t>
-      </w:r>
-      <w:r>
-        <w:br/>
-        <w:t>Mã hóa AES-128-CBC</w:t>
-      </w:r>
-      <w:r>
-        <w:br/>
-        <w:t xml:space="preserve">  ↓</w:t>
-      </w:r>
-      <w:r>
-        <w:br/>
-        <w:t>Ghép IV và ciphertext</w:t>
-      </w:r>
-      <w:r>
-        <w:br/>
-        <w:t xml:space="preserve">  ↓</w:t>
-      </w:r>
-      <w:r>
-        <w:br/>
-        <w:t>Chuyển payload sang hex</w:t>
-      </w:r>
-      <w:r>
-        <w:br/>
-        <w:t xml:space="preserve">  ↓</w:t>
-      </w:r>
-      <w:r>
-        <w:br/>
-        <w:t>Gửi payload đến Gateway</w:t>
-      </w:r>
-      <w:r>
-        <w:br/>
-        <w:t xml:space="preserve">  ↓</w:t>
-      </w:r>
-      <w:r>
-        <w:br/>
-        <w:t>Tăng sequence number</w:t>
-      </w:r>
-      <w:r>
-        <w:br/>
-        <w:t xml:space="preserve">  ↓</w:t>
-      </w:r>
-      <w:r>
+        <w:t>Tăng sequence number ↓</w:t>
         <w:br/>
         <w:t>Chờ chu kỳ gửi tiếp theo</w:t>
       </w:r>
+      <w:r/>
+      <w:r/>
+      <w:r/>
+      <w:r/>
+      <w:r/>
+      <w:r/>
+      <w:r/>
+      <w:r/>
+      <w:r/>
+      <w:r/>
+      <w:r/>
+      <w:r/>
+      <w:r/>
+      <w:r/>
+      <w:r/>
+      <w:r/>
+      <w:r/>
+      <w:r/>
+      <w:r/>
+      <w:r/>
+      <w:r/>
+      <w:r/>
+      <w:r/>
+      <w:r/>
+      <w:r/>
+      <w:r/>
+      <w:r/>
+      <w:r/>
+      <w:r/>
+      <w:r/>
+      <w:r/>
+      <w:r/>
+      <w:r/>
+      <w:r/>
+      <w:r/>
+      <w:r/>
+      <w:r/>
+      <w:r/>
+      <w:r/>
+      <w:r/>
     </w:p>
     <w:p>
       <w:pPr>
@@ -6884,72 +6729,26 @@
         <w:keepLines/>
       </w:pPr>
       <w:r>
-        <w:t>{</w:t>
-      </w:r>
-      <w:r>
-        <w:br/>
-        <w:t xml:space="preserve">  "id": "Xi_01",</w:t>
-      </w:r>
-      <w:r>
-        <w:br/>
-        <w:t xml:space="preserve">  "t": 28.5,</w:t>
-      </w:r>
-      <w:r>
-        <w:br/>
-        <w:t xml:space="preserve">  "h": 65.2,</w:t>
-      </w:r>
-      <w:r>
-        <w:br/>
-        <w:t xml:space="preserve">  "p": 1008.0,</w:t>
-      </w:r>
-      <w:r>
-        <w:br/>
-        <w:t xml:space="preserve">  "hr": 75,</w:t>
-      </w:r>
-      <w:r>
-        <w:br/>
-        <w:t xml:space="preserve">  "spo2": 96,</w:t>
-      </w:r>
-      <w:r>
-        <w:br/>
-        <w:t xml:space="preserve">  "co2": 420,</w:t>
-      </w:r>
-      <w:r>
-        <w:br/>
-        <w:t xml:space="preserve">  "co": 5.1,</w:t>
-      </w:r>
-      <w:r>
-        <w:br/>
-        <w:t xml:space="preserve">  "nh3": 2.3,</w:t>
-      </w:r>
-      <w:r>
-        <w:br/>
-        <w:t xml:space="preserve">  "lat": 21.8447,</w:t>
-      </w:r>
-      <w:r>
-        <w:br/>
-        <w:t xml:space="preserve">  "lon": 104.097,</w:t>
-      </w:r>
-      <w:r>
-        <w:br/>
-        <w:t xml:space="preserve">  "alt": 10,</w:t>
-      </w:r>
-      <w:r>
-        <w:br/>
-        <w:t xml:space="preserve">  "sats": 7,</w:t>
-      </w:r>
-      <w:r>
-        <w:br/>
-        <w:t xml:space="preserve">  "gw": "Y_01",</w:t>
-      </w:r>
-      <w:r>
-        <w:br/>
-        <w:t xml:space="preserve">  "seq": 1001</w:t>
-      </w:r>
-      <w:r>
+        <w:t>{ "id": "Xi_01", "t": 28.5, "h": 65.2, "p": 1008.0,"": 96, "co2": 420, "co": 5.1, "nh3": 2.3, "lat": 21.8447, "lon": 104.097, "alt": 10, "sats": 7, "gw": "Y_01", "seq": 1001</w:t>
         <w:br/>
         <w:t>}</w:t>
       </w:r>
+      <w:r/>
+      <w:r/>
+      <w:r/>
+      <w:r/>
+      <w:r/>
+      <w:r/>
+      <w:r/>
+      <w:r/>
+      <w:r/>
+      <w:r/>
+      <w:r/>
+      <w:r/>
+      <w:r/>
+      <w:r/>
+      <w:r/>
+      <w:r/>
     </w:p>
     <w:p>
       <w:pPr>
@@ -7512,7 +7311,6 @@
               <w:rPr>
                 <w:sz w:val="20"/>
               </w:rPr>
-              <w:t>Nhịp tim</w:t>
             </w:r>
           </w:p>
         </w:tc>
@@ -7586,7 +7384,7 @@
               <w:rPr>
                 <w:sz w:val="20"/>
               </w:rPr>
-              <w:t>`spo2`</w:t>
+              <w:t>``</w:t>
             </w:r>
           </w:p>
         </w:tc>
@@ -9410,144 +9208,76 @@
         <w:keepLines/>
       </w:pPr>
       <w:r>
-        <w:t>Bắt đầu</w:t>
-      </w:r>
-      <w:r>
+        <w:t>Bắt đầu ↓</w:t>
         <w:br/>
-        <w:t xml:space="preserve">  ↓</w:t>
-      </w:r>
-      <w:r>
+        <w:t>Khởi tạo Gateway ↓</w:t>
         <w:br/>
-        <w:t>Khởi tạo Gateway</w:t>
-      </w:r>
-      <w:r>
+        <w:t>Thiết lập mã Gateway và địa chỉ Server ↓</w:t>
         <w:br/>
-        <w:t xml:space="preserve">  ↓</w:t>
-      </w:r>
-      <w:r>
+        <w:t>Kết nối Wi-Fi ↓</w:t>
         <w:br/>
-        <w:t>Thiết lập mã Gateway và địa chỉ Server</w:t>
-      </w:r>
-      <w:r>
+        <w:t>Chờ Beacon từ node Xi ↓</w:t>
         <w:br/>
-        <w:t xml:space="preserve">  ↓</w:t>
-      </w:r>
-      <w:r>
+        <w:t>Nhận Beacon ↓</w:t>
         <w:br/>
-        <w:t>Kết nối Wi-Fi</w:t>
-      </w:r>
-      <w:r>
+        <w:t>Kiểm tra Beacon có đúng định dạng B|Xi_ID hay không ↓</w:t>
         <w:br/>
-        <w:t xml:space="preserve">  ↓</w:t>
-      </w:r>
-      <w:r>
+        <w:t>Nếu Beacon không hợp lệ → bỏ qua ↓</w:t>
         <w:br/>
-        <w:t>Chờ Beacon từ node Xi</w:t>
-      </w:r>
-      <w:r>
+        <w:t>Nếu Beacon hợp lệ → lấy Xi_ID ↓</w:t>
         <w:br/>
-        <w:t xml:space="preserve">  ↓</w:t>
-      </w:r>
-      <w:r>
+        <w:t>Tạo ACK dạng A|Xi_ID|Y_ID ↓</w:t>
         <w:br/>
-        <w:t>Nhận Beacon</w:t>
-      </w:r>
-      <w:r>
+        <w:t>Gửi ACK về node Xi ↓</w:t>
         <w:br/>
-        <w:t xml:space="preserve">  ↓</w:t>
-      </w:r>
-      <w:r>
+        <w:t>Chờ payload mã hóa ↓</w:t>
         <w:br/>
-        <w:t>Kiểm tra Beacon có đúng định dạng B|Xi_ID hay không</w:t>
-      </w:r>
-      <w:r>
+        <w:t>Nhận payload từ node ↓</w:t>
         <w:br/>
-        <w:t xml:space="preserve">  ↓</w:t>
-      </w:r>
-      <w:r>
+        <w:t>Đóng gói JSON chứa trường payload ↓</w:t>
         <w:br/>
-        <w:t>Nếu Beacon không hợp lệ → bỏ qua</w:t>
-      </w:r>
-      <w:r>
+        <w:t>Gửi HTTP POST đến Flask Server ↓</w:t>
         <w:br/>
-        <w:t xml:space="preserve">  ↓</w:t>
-      </w:r>
-      <w:r>
+        <w:t>Nhận response từ Server ↓</w:t>
         <w:br/>
-        <w:t>Nếu Beacon hợp lệ → lấy Xi_ID</w:t>
-      </w:r>
-      <w:r>
-        <w:br/>
-        <w:t xml:space="preserve">  ↓</w:t>
-      </w:r>
-      <w:r>
-        <w:br/>
-        <w:t>Tạo ACK dạng A|Xi_ID|Y_ID</w:t>
-      </w:r>
-      <w:r>
-        <w:br/>
-        <w:t xml:space="preserve">  ↓</w:t>
-      </w:r>
-      <w:r>
-        <w:br/>
-        <w:t>Gửi ACK về node Xi</w:t>
-      </w:r>
-      <w:r>
-        <w:br/>
-        <w:t xml:space="preserve">  ↓</w:t>
-      </w:r>
-      <w:r>
-        <w:br/>
-        <w:t>Chờ payload mã hóa</w:t>
-      </w:r>
-      <w:r>
-        <w:br/>
-        <w:t xml:space="preserve">  ↓</w:t>
-      </w:r>
-      <w:r>
-        <w:br/>
-        <w:t>Nhận payload từ node</w:t>
-      </w:r>
-      <w:r>
-        <w:br/>
-        <w:t xml:space="preserve">  ↓</w:t>
-      </w:r>
-      <w:r>
-        <w:br/>
-        <w:t>Đóng gói JSON chứa trường payload</w:t>
-      </w:r>
-      <w:r>
-        <w:br/>
-        <w:t xml:space="preserve">  ↓</w:t>
-      </w:r>
-      <w:r>
-        <w:br/>
-        <w:t>Gửi HTTP POST đến Flask Server</w:t>
-      </w:r>
-      <w:r>
-        <w:br/>
-        <w:t xml:space="preserve">  ↓</w:t>
-      </w:r>
-      <w:r>
-        <w:br/>
-        <w:t>Nhận response từ Server</w:t>
-      </w:r>
-      <w:r>
-        <w:br/>
-        <w:t xml:space="preserve">  ↓</w:t>
-      </w:r>
-      <w:r>
-        <w:br/>
-        <w:t>Hiển thị trạng thái</w:t>
-      </w:r>
-      <w:r>
-        <w:br/>
-        <w:t xml:space="preserve">  ↓</w:t>
-      </w:r>
-      <w:r>
+        <w:t>Hiển thị trạng thái ↓</w:t>
         <w:br/>
         <w:t>Tiếp tục chờ dữ liệu mới</w:t>
       </w:r>
+      <w:r/>
+      <w:r/>
+      <w:r/>
+      <w:r/>
+      <w:r/>
+      <w:r/>
+      <w:r/>
+      <w:r/>
+      <w:r/>
+      <w:r/>
+      <w:r/>
+      <w:r/>
+      <w:r/>
+      <w:r/>
+      <w:r/>
+      <w:r/>
+      <w:r/>
+      <w:r/>
+      <w:r/>
+      <w:r/>
+      <w:r/>
+      <w:r/>
+      <w:r/>
+      <w:r/>
+      <w:r/>
+      <w:r/>
+      <w:r/>
+      <w:r/>
+      <w:r/>
+      <w:r/>
+      <w:r/>
+      <w:r/>
+      <w:r/>
+      <w:r/>
     </w:p>
     <w:p>
       <w:pPr>
@@ -9578,16 +9308,12 @@
         <w:keepLines/>
       </w:pPr>
       <w:r>
-        <w:t>{</w:t>
-      </w:r>
-      <w:r>
-        <w:br/>
-        <w:t xml:space="preserve">  "payload": "&lt;chuỗi hex của IV và ciphertext&gt;"</w:t>
-      </w:r>
-      <w:r>
+        <w:t>{ "payload": "&lt;chuỗi hex của IV và ciphertext&gt;"</w:t>
         <w:br/>
         <w:t>}</w:t>
       </w:r>
+      <w:r/>
+      <w:r/>
     </w:p>
     <w:p>
       <w:pPr>
@@ -9603,16 +9329,12 @@
         <w:keepLines/>
       </w:pPr>
       <w:r>
-        <w:t>{</w:t>
-      </w:r>
-      <w:r>
-        <w:br/>
-        <w:t xml:space="preserve">  "payload": "8fa23c91e5a79870b1cd34..."</w:t>
-      </w:r>
-      <w:r>
+        <w:t>{ "payload": "8fa23c91e5a79870b1cd34..."</w:t>
         <w:br/>
         <w:t>}</w:t>
       </w:r>
+      <w:r/>
+      <w:r/>
     </w:p>
     <w:p>
       <w:pPr>
@@ -9736,32 +9458,16 @@
         <w:keepLines/>
       </w:pPr>
       <w:r>
-        <w:t>{</w:t>
-      </w:r>
-      <w:r>
-        <w:br/>
-        <w:t xml:space="preserve">  "id": "Xi_01",</w:t>
-      </w:r>
-      <w:r>
-        <w:br/>
-        <w:t xml:space="preserve">  "t": 28.5,</w:t>
-      </w:r>
-      <w:r>
-        <w:br/>
-        <w:t xml:space="preserve">  "h": 65.2,</w:t>
-      </w:r>
-      <w:r>
-        <w:br/>
-        <w:t xml:space="preserve">  "gw": "Y_01",</w:t>
-      </w:r>
-      <w:r>
-        <w:br/>
-        <w:t xml:space="preserve">  "seq": 1001</w:t>
-      </w:r>
-      <w:r>
+        <w:t>{ "id": "Xi_01", "t": 28.5, "h": 65.2, "gw": "Y_01", "seq": 1001</w:t>
         <w:br/>
         <w:t>}</w:t>
       </w:r>
+      <w:r/>
+      <w:r/>
+      <w:r/>
+      <w:r/>
+      <w:r/>
+      <w:r/>
     </w:p>
     <w:p>
       <w:pPr>
@@ -10276,16 +9982,14 @@
         <w:keepLines/>
       </w:pPr>
       <w:r>
-        <w:t>IV:         16 byte đầu</w:t>
-      </w:r>
-      <w:r>
+        <w:t>IV: 16 byte đầu</w:t>
         <w:br/>
         <w:t>Ciphertext: các byte còn lại</w:t>
-      </w:r>
-      <w:r>
         <w:br/>
-        <w:t>Payload:   IV + Ciphertext</w:t>
-      </w:r>
+        <w:t>Payload: IV + Ciphertext</w:t>
+      </w:r>
+      <w:r/>
+      <w:r/>
     </w:p>
     <w:p>
       <w:pPr>
@@ -10298,88 +10002,48 @@
         <w:keepLines/>
       </w:pPr>
       <w:r>
-        <w:t>Dữ liệu cảm biến và GPS</w:t>
-      </w:r>
-      <w:r>
+        <w:t>Dữ liệu cảm biến và GPS ↓</w:t>
         <w:br/>
-        <w:t xml:space="preserve">        ↓</w:t>
-      </w:r>
-      <w:r>
+        <w:t>Tạo JSON ↓</w:t>
         <w:br/>
-        <w:t>Tạo JSON</w:t>
-      </w:r>
-      <w:r>
+        <w:t>Thêm id, gw và seq ↓</w:t>
         <w:br/>
-        <w:t xml:space="preserve">        ↓</w:t>
-      </w:r>
-      <w:r>
+        <w:t>Chuyển JSON thành byte ↓</w:t>
         <w:br/>
-        <w:t>Thêm id, gw và seq</w:t>
-      </w:r>
-      <w:r>
+        <w:t>Tính padding ↓</w:t>
         <w:br/>
-        <w:t xml:space="preserve">        ↓</w:t>
-      </w:r>
-      <w:r>
+        <w:t>Thêm padding ↓</w:t>
         <w:br/>
-        <w:t>Chuyển JSON thành byte</w:t>
-      </w:r>
-      <w:r>
+        <w:t>Tạo IV 16 byte ↓</w:t>
         <w:br/>
-        <w:t xml:space="preserve">        ↓</w:t>
-      </w:r>
-      <w:r>
+        <w:t>Mã hóa AES-128-CBC ↓</w:t>
         <w:br/>
-        <w:t>Tính padding</w:t>
-      </w:r>
-      <w:r>
+        <w:t>Ghép IV + ciphertext ↓</w:t>
         <w:br/>
-        <w:t xml:space="preserve">        ↓</w:t>
-      </w:r>
-      <w:r>
-        <w:br/>
-        <w:t>Thêm padding</w:t>
-      </w:r>
-      <w:r>
-        <w:br/>
-        <w:t xml:space="preserve">        ↓</w:t>
-      </w:r>
-      <w:r>
-        <w:br/>
-        <w:t>Tạo IV 16 byte</w:t>
-      </w:r>
-      <w:r>
-        <w:br/>
-        <w:t xml:space="preserve">        ↓</w:t>
-      </w:r>
-      <w:r>
-        <w:br/>
-        <w:t>Mã hóa AES-128-CBC</w:t>
-      </w:r>
-      <w:r>
-        <w:br/>
-        <w:t xml:space="preserve">        ↓</w:t>
-      </w:r>
-      <w:r>
-        <w:br/>
-        <w:t>Ghép IV + ciphertext</w:t>
-      </w:r>
-      <w:r>
-        <w:br/>
-        <w:t xml:space="preserve">        ↓</w:t>
-      </w:r>
-      <w:r>
-        <w:br/>
-        <w:t>Chuyển sang chuỗi hex</w:t>
-      </w:r>
-      <w:r>
-        <w:br/>
-        <w:t xml:space="preserve">        ↓</w:t>
-      </w:r>
-      <w:r>
+        <w:t>Chuyển sang chuỗi hex ↓</w:t>
         <w:br/>
         <w:t>Gửi payload đến Gateway</w:t>
       </w:r>
+      <w:r/>
+      <w:r/>
+      <w:r/>
+      <w:r/>
+      <w:r/>
+      <w:r/>
+      <w:r/>
+      <w:r/>
+      <w:r/>
+      <w:r/>
+      <w:r/>
+      <w:r/>
+      <w:r/>
+      <w:r/>
+      <w:r/>
+      <w:r/>
+      <w:r/>
+      <w:r/>
+      <w:r/>
+      <w:r/>
     </w:p>
     <w:p>
       <w:pPr>
@@ -10392,64 +10056,36 @@
         <w:keepLines/>
       </w:pPr>
       <w:r>
-        <w:t>Nhận payload hex</w:t>
-      </w:r>
-      <w:r>
+        <w:t>Nhận payload hex ↓</w:t>
         <w:br/>
-        <w:t xml:space="preserve">        ↓</w:t>
-      </w:r>
-      <w:r>
+        <w:t>Chuyển hex thành byte ↓</w:t>
         <w:br/>
-        <w:t>Chuyển hex thành byte</w:t>
-      </w:r>
-      <w:r>
+        <w:t>Tách 16 byte đầu làm IV ↓</w:t>
         <w:br/>
-        <w:t xml:space="preserve">        ↓</w:t>
-      </w:r>
-      <w:r>
+        <w:t>Lấy phần còn lại làm ciphertext ↓</w:t>
         <w:br/>
-        <w:t>Tách 16 byte đầu làm IV</w:t>
-      </w:r>
-      <w:r>
+        <w:t>Giải mã AES-128-CBC ↓</w:t>
         <w:br/>
-        <w:t xml:space="preserve">        ↓</w:t>
-      </w:r>
-      <w:r>
+        <w:t>Loại bỏ padding ↓</w:t>
         <w:br/>
-        <w:t>Lấy phần còn lại làm ciphertext</w:t>
-      </w:r>
-      <w:r>
-        <w:br/>
-        <w:t xml:space="preserve">        ↓</w:t>
-      </w:r>
-      <w:r>
-        <w:br/>
-        <w:t>Giải mã AES-128-CBC</w:t>
-      </w:r>
-      <w:r>
-        <w:br/>
-        <w:t xml:space="preserve">        ↓</w:t>
-      </w:r>
-      <w:r>
-        <w:br/>
-        <w:t>Loại bỏ padding</w:t>
-      </w:r>
-      <w:r>
-        <w:br/>
-        <w:t xml:space="preserve">        ↓</w:t>
-      </w:r>
-      <w:r>
-        <w:br/>
-        <w:t>Khôi phục JSON plaintext</w:t>
-      </w:r>
-      <w:r>
-        <w:br/>
-        <w:t xml:space="preserve">        ↓</w:t>
-      </w:r>
-      <w:r>
+        <w:t>Khôi phục JSON plaintext ↓</w:t>
         <w:br/>
         <w:t>Kiểm tra dữ liệu</w:t>
       </w:r>
+      <w:r/>
+      <w:r/>
+      <w:r/>
+      <w:r/>
+      <w:r/>
+      <w:r/>
+      <w:r/>
+      <w:r/>
+      <w:r/>
+      <w:r/>
+      <w:r/>
+      <w:r/>
+      <w:r/>
+      <w:r/>
     </w:p>
     <w:p>
       <w:pPr>
@@ -10638,16 +10274,12 @@
         <w:keepLines/>
       </w:pPr>
       <w:r>
-        <w:t>{</w:t>
-      </w:r>
-      <w:r>
-        <w:br/>
-        <w:t xml:space="preserve">  "payload": "&lt;chuỗi hex&gt;"</w:t>
-      </w:r>
-      <w:r>
+        <w:t>{ "payload": "&lt;chuỗi hex&gt;"</w:t>
         <w:br/>
         <w:t>}</w:t>
       </w:r>
+      <w:r/>
+      <w:r/>
     </w:p>
     <w:p>
       <w:pPr>
@@ -10663,20 +10295,13 @@
         <w:keepLines/>
       </w:pPr>
       <w:r>
-        <w:t>{</w:t>
-      </w:r>
-      <w:r>
-        <w:br/>
-        <w:t xml:space="preserve">  "status": "success",</w:t>
-      </w:r>
-      <w:r>
-        <w:br/>
-        <w:t xml:space="preserve">  "message": "Data saved successfully"</w:t>
-      </w:r>
-      <w:r>
+        <w:t>{ "status": "success", "message": "Data saved successfully"</w:t>
         <w:br/>
         <w:t>}</w:t>
       </w:r>
+      <w:r/>
+      <w:r/>
+      <w:r/>
     </w:p>
     <w:p>
       <w:pPr>
@@ -10692,20 +10317,13 @@
         <w:keepLines/>
       </w:pPr>
       <w:r>
-        <w:t>{</w:t>
-      </w:r>
-      <w:r>
-        <w:br/>
-        <w:t xml:space="preserve">  "status": "error",</w:t>
-      </w:r>
-      <w:r>
-        <w:br/>
-        <w:t xml:space="preserve">  "message": "Invalid payload"</w:t>
-      </w:r>
-      <w:r>
+        <w:t>{ "status": "error", "message": "Invalid payload"</w:t>
         <w:br/>
         <w:t>}</w:t>
       </w:r>
+      <w:r/>
+      <w:r/>
+      <w:r/>
     </w:p>
     <w:p>
       <w:pPr>
@@ -10718,216 +10336,112 @@
         <w:keepLines/>
       </w:pPr>
       <w:r>
-        <w:t>Bắt đầu nhận request</w:t>
-      </w:r>
-      <w:r>
+        <w:t>Bắt đầu nhận request ↓</w:t>
         <w:br/>
-        <w:t xml:space="preserve">  ↓</w:t>
-      </w:r>
-      <w:r>
+        <w:t>Đọc JSON body ↓</w:t>
         <w:br/>
-        <w:t>Đọc JSON body</w:t>
-      </w:r>
-      <w:r>
+        <w:t>Kiểm tra body có tồn tại không ↓</w:t>
         <w:br/>
-        <w:t xml:space="preserve">  ↓</w:t>
-      </w:r>
-      <w:r>
+        <w:t>Kiểm tra trường payload ↓</w:t>
         <w:br/>
-        <w:t>Kiểm tra body có tồn tại không</w:t>
-      </w:r>
-      <w:r>
+        <w:t>Nếu thiếu payload → trả lỗi ↓</w:t>
         <w:br/>
-        <w:t xml:space="preserve">  ↓</w:t>
-      </w:r>
-      <w:r>
+        <w:t>Chuyển payload hex thành byte ↓</w:t>
         <w:br/>
-        <w:t>Kiểm tra trường payload</w:t>
-      </w:r>
-      <w:r>
+        <w:t>Nếu không chuyển được → trả lỗi định dạng ↓</w:t>
         <w:br/>
-        <w:t xml:space="preserve">  ↓</w:t>
-      </w:r>
-      <w:r>
+        <w:t>Kiểm tra độ dài payload ↓</w:t>
         <w:br/>
-        <w:t>Nếu thiếu payload → trả lỗi</w:t>
-      </w:r>
-      <w:r>
+        <w:t>Nếu payload nhỏ hơn hoặc bằng 16 byte → trả lỗi ↓</w:t>
         <w:br/>
-        <w:t xml:space="preserve">  ↓</w:t>
-      </w:r>
-      <w:r>
+        <w:t>Tách IV = 16 byte đầu ↓</w:t>
         <w:br/>
-        <w:t>Chuyển payload hex thành byte</w:t>
-      </w:r>
-      <w:r>
+        <w:t>Tách ciphertext = phần còn lại ↓</w:t>
         <w:br/>
-        <w:t xml:space="preserve">  ↓</w:t>
-      </w:r>
-      <w:r>
+        <w:t>Giải mã AES-128-CBC ↓</w:t>
         <w:br/>
-        <w:t>Nếu không chuyển được → trả lỗi định dạng</w:t>
-      </w:r>
-      <w:r>
+        <w:t>Nếu giải mã thất bại → trả lỗi ↓</w:t>
         <w:br/>
-        <w:t xml:space="preserve">  ↓</w:t>
-      </w:r>
-      <w:r>
+        <w:t>Loại bỏ padding ↓</w:t>
         <w:br/>
-        <w:t>Kiểm tra độ dài payload</w:t>
-      </w:r>
-      <w:r>
+        <w:t>Nếu padding sai → trả lỗi ↓</w:t>
         <w:br/>
-        <w:t xml:space="preserve">  ↓</w:t>
-      </w:r>
-      <w:r>
+        <w:t>Chuyển plaintext thành JSON ↓</w:t>
         <w:br/>
-        <w:t>Nếu payload nhỏ hơn hoặc bằng 16 byte → trả lỗi</w:t>
-      </w:r>
-      <w:r>
+        <w:t>Nếu JSON sai → trả lỗi ↓</w:t>
         <w:br/>
-        <w:t xml:space="preserve">  ↓</w:t>
-      </w:r>
-      <w:r>
+        <w:t>Lấy device_id và sequence number ↓</w:t>
         <w:br/>
-        <w:t>Tách IV = 16 byte đầu</w:t>
-      </w:r>
-      <w:r>
+        <w:t>Nếu thiếu thông tin → trả lỗi ↓</w:t>
         <w:br/>
-        <w:t xml:space="preserve">  ↓</w:t>
-      </w:r>
-      <w:r>
+        <w:t>Đọc last_seq từ database ↓</w:t>
         <w:br/>
-        <w:t>Tách ciphertext = phần còn lại</w:t>
-      </w:r>
-      <w:r>
+        <w:t>So sánh seq_received với last_seq ↓</w:t>
         <w:br/>
-        <w:t xml:space="preserve">  ↓</w:t>
-      </w:r>
-      <w:r>
+        <w:t>Nếu seq_received &lt;= last_seq → từ chối replay ↓</w:t>
         <w:br/>
-        <w:t>Giải mã AES-128-CBC</w:t>
-      </w:r>
-      <w:r>
+        <w:t>Nếu seq_received &gt; last_seq → chấp nhận ↓</w:t>
         <w:br/>
-        <w:t xml:space="preserve">  ↓</w:t>
-      </w:r>
-      <w:r>
+        <w:t>Lưu telemetry ↓</w:t>
         <w:br/>
-        <w:t>Nếu giải mã thất bại → trả lỗi</w:t>
-      </w:r>
-      <w:r>
+        <w:t>Cập nhật last_seq ↓</w:t>
         <w:br/>
-        <w:t xml:space="preserve">  ↓</w:t>
-      </w:r>
-      <w:r>
-        <w:br/>
-        <w:t>Loại bỏ padding</w:t>
-      </w:r>
-      <w:r>
-        <w:br/>
-        <w:t xml:space="preserve">  ↓</w:t>
-      </w:r>
-      <w:r>
-        <w:br/>
-        <w:t>Nếu padding sai → trả lỗi</w:t>
-      </w:r>
-      <w:r>
-        <w:br/>
-        <w:t xml:space="preserve">  ↓</w:t>
-      </w:r>
-      <w:r>
-        <w:br/>
-        <w:t>Chuyển plaintext thành JSON</w:t>
-      </w:r>
-      <w:r>
-        <w:br/>
-        <w:t xml:space="preserve">  ↓</w:t>
-      </w:r>
-      <w:r>
-        <w:br/>
-        <w:t>Nếu JSON sai → trả lỗi</w:t>
-      </w:r>
-      <w:r>
-        <w:br/>
-        <w:t xml:space="preserve">  ↓</w:t>
-      </w:r>
-      <w:r>
-        <w:br/>
-        <w:t>Lấy device_id và sequence number</w:t>
-      </w:r>
-      <w:r>
-        <w:br/>
-        <w:t xml:space="preserve">  ↓</w:t>
-      </w:r>
-      <w:r>
-        <w:br/>
-        <w:t>Nếu thiếu thông tin → trả lỗi</w:t>
-      </w:r>
-      <w:r>
-        <w:br/>
-        <w:t xml:space="preserve">  ↓</w:t>
-      </w:r>
-      <w:r>
-        <w:br/>
-        <w:t>Đọc last_seq từ database</w:t>
-      </w:r>
-      <w:r>
-        <w:br/>
-        <w:t xml:space="preserve">  ↓</w:t>
-      </w:r>
-      <w:r>
-        <w:br/>
-        <w:t>So sánh seq_received với last_seq</w:t>
-      </w:r>
-      <w:r>
-        <w:br/>
-        <w:t xml:space="preserve">  ↓</w:t>
-      </w:r>
-      <w:r>
-        <w:br/>
-        <w:t>Nếu seq_received &lt;= last_seq → từ chối replay</w:t>
-      </w:r>
-      <w:r>
-        <w:br/>
-        <w:t xml:space="preserve">  ↓</w:t>
-      </w:r>
-      <w:r>
-        <w:br/>
-        <w:t>Nếu seq_received &gt; last_seq → chấp nhận</w:t>
-      </w:r>
-      <w:r>
-        <w:br/>
-        <w:t xml:space="preserve">  ↓</w:t>
-      </w:r>
-      <w:r>
-        <w:br/>
-        <w:t>Lưu telemetry</w:t>
-      </w:r>
-      <w:r>
-        <w:br/>
-        <w:t xml:space="preserve">  ↓</w:t>
-      </w:r>
-      <w:r>
-        <w:br/>
-        <w:t>Cập nhật last_seq</w:t>
-      </w:r>
-      <w:r>
-        <w:br/>
-        <w:t xml:space="preserve">  ↓</w:t>
-      </w:r>
-      <w:r>
-        <w:br/>
-        <w:t>Ghi benchmark</w:t>
-      </w:r>
-      <w:r>
-        <w:br/>
-        <w:t xml:space="preserve">  ↓</w:t>
-      </w:r>
-      <w:r>
+        <w:t>Ghi benchmark ↓</w:t>
         <w:br/>
         <w:t>Trả kết quả thành công</w:t>
       </w:r>
+      <w:r/>
+      <w:r/>
+      <w:r/>
+      <w:r/>
+      <w:r/>
+      <w:r/>
+      <w:r/>
+      <w:r/>
+      <w:r/>
+      <w:r/>
+      <w:r/>
+      <w:r/>
+      <w:r/>
+      <w:r/>
+      <w:r/>
+      <w:r/>
+      <w:r/>
+      <w:r/>
+      <w:r/>
+      <w:r/>
+      <w:r/>
+      <w:r/>
+      <w:r/>
+      <w:r/>
+      <w:r/>
+      <w:r/>
+      <w:r/>
+      <w:r/>
+      <w:r/>
+      <w:r/>
+      <w:r/>
+      <w:r/>
+      <w:r/>
+      <w:r/>
+      <w:r/>
+      <w:r/>
+      <w:r/>
+      <w:r/>
+      <w:r/>
+      <w:r/>
+      <w:r/>
+      <w:r/>
+      <w:r/>
+      <w:r/>
+      <w:r/>
+      <w:r/>
+      <w:r/>
+      <w:r/>
+      <w:r/>
+      <w:r/>
+      <w:r/>
+      <w:r/>
     </w:p>
     <w:p>
       <w:pPr>
@@ -12205,17 +11719,14 @@
         <w:keepLines/>
       </w:pPr>
       <w:r>
-        <w:lastRenderedPageBreak/>
         <w:t>Gói thứ nhất: seq = 1001</w:t>
-      </w:r>
-      <w:r>
         <w:br/>
-        <w:t>Gói thứ hai:  seq = 1002</w:t>
-      </w:r>
-      <w:r>
+        <w:t>Gói thứ hai: seq = 1002</w:t>
         <w:br/>
-        <w:t>Gói thứ ba:   seq = 1003</w:t>
-      </w:r>
+        <w:t>Gói thứ ba: seq = 1003</w:t>
+      </w:r>
+      <w:r/>
+      <w:r/>
     </w:p>
     <w:p>
       <w:pPr>
@@ -12292,87 +11803,37 @@
         <w:keepLines/>
       </w:pPr>
       <w:r>
-        <w:t>Input: device_id, seq_received</w:t>
-      </w:r>
-      <w:r>
+        <w:t>Input: device_id, seq_received Bước 1: Lấy last_seq của device_id từ database Bước 2:</w:t>
         <w:br/>
-      </w:r>
-      <w:r>
+        <w:t>Nếu chưa có device_id trong database: Tạo device mới Chấp nhận seq_received Bước 3:</w:t>
         <w:br/>
-        <w:t>Bước 1: Lấy last_seq của device_id từ database</w:t>
-      </w:r>
-      <w:r>
+        <w:t>Nếu device_id đã tồn tại: So sánh seq_received với last_seq Bước 4:</w:t>
         <w:br/>
-      </w:r>
-      <w:r>
+        <w:t>Nếu seq_received &gt; last_seq: Chấp nhận dữ liệu Cập nhật last_seq = seq_received Bước 5:</w:t>
         <w:br/>
-        <w:t>Bước 2:</w:t>
-      </w:r>
-      <w:r>
-        <w:br/>
-        <w:t>Nếu chưa có device_id trong database:</w:t>
-      </w:r>
-      <w:r>
-        <w:br/>
-        <w:t xml:space="preserve">    Tạo device mới</w:t>
-      </w:r>
-      <w:r>
-        <w:br/>
-        <w:t xml:space="preserve">    Chấp nhận seq_received</w:t>
-      </w:r>
-      <w:r>
-        <w:br/>
-      </w:r>
-      <w:r>
-        <w:br/>
-        <w:t>Bước 3:</w:t>
-      </w:r>
-      <w:r>
-        <w:br/>
-        <w:t>Nếu device_id đã tồn tại:</w:t>
-      </w:r>
-      <w:r>
-        <w:br/>
-        <w:t xml:space="preserve">    So sánh seq_received với last_seq</w:t>
-      </w:r>
-      <w:r>
-        <w:br/>
-      </w:r>
-      <w:r>
-        <w:br/>
-        <w:t>Bước 4:</w:t>
-      </w:r>
-      <w:r>
-        <w:br/>
-        <w:t>Nếu seq_received &gt; last_seq:</w:t>
-      </w:r>
-      <w:r>
-        <w:br/>
-        <w:t xml:space="preserve">    Chấp nhận dữ liệu</w:t>
-      </w:r>
-      <w:r>
-        <w:br/>
-        <w:t xml:space="preserve">    Cập nhật last_seq = seq_received</w:t>
-      </w:r>
-      <w:r>
-        <w:br/>
-      </w:r>
-      <w:r>
-        <w:br/>
-        <w:t>Bước 5:</w:t>
-      </w:r>
-      <w:r>
-        <w:br/>
-        <w:t>Nếu seq_received &lt;= last_seq:</w:t>
-      </w:r>
-      <w:r>
-        <w:br/>
-        <w:t xml:space="preserve">    Từ chối dữ liệu</w:t>
-      </w:r>
-      <w:r>
-        <w:br/>
-        <w:t xml:space="preserve">    Ghi nhận trạng thái replay</w:t>
-      </w:r>
+        <w:t>Nếu seq_received &lt;= last_seq: Từ chối dữ liệu Ghi nhận trạng thái replay</w:t>
+      </w:r>
+      <w:r/>
+      <w:r/>
+      <w:r/>
+      <w:r/>
+      <w:r/>
+      <w:r/>
+      <w:r/>
+      <w:r/>
+      <w:r/>
+      <w:r/>
+      <w:r/>
+      <w:r/>
+      <w:r/>
+      <w:r/>
+      <w:r/>
+      <w:r/>
+      <w:r/>
+      <w:r/>
+      <w:r/>
+      <w:r/>
+      <w:r/>
     </w:p>
     <w:p>
       <w:pPr>
@@ -14328,154 +13789,6 @@
                 <w:sz w:val="20"/>
               </w:rPr>
               <w:t>Áp suất</w:t>
-            </w:r>
-          </w:p>
-        </w:tc>
-      </w:tr>
-      <w:tr>
-        <w:trPr>
-          <w:jc w:val="center"/>
-        </w:trPr>
-        <w:tc>
-          <w:tcPr>
-            <w:tcW w:w="2929" w:type="dxa"/>
-            <w:tcMar>
-              <w:top w:w="80" w:type="dxa"/>
-              <w:left w:w="80" w:type="dxa"/>
-              <w:bottom w:w="80" w:type="dxa"/>
-              <w:right w:w="80" w:type="dxa"/>
-            </w:tcMar>
-            <w:vAlign w:val="center"/>
-          </w:tcPr>
-          <w:p>
-            <w:pPr>
-              <w:spacing w:after="0" w:line="264" w:lineRule="auto"/>
-            </w:pPr>
-            <w:r>
-              <w:rPr>
-                <w:sz w:val="20"/>
-              </w:rPr>
-              <w:t>`heart_rate`</w:t>
-            </w:r>
-          </w:p>
-        </w:tc>
-        <w:tc>
-          <w:tcPr>
-            <w:tcW w:w="2929" w:type="dxa"/>
-            <w:tcMar>
-              <w:top w:w="80" w:type="dxa"/>
-              <w:left w:w="80" w:type="dxa"/>
-              <w:bottom w:w="80" w:type="dxa"/>
-              <w:right w:w="80" w:type="dxa"/>
-            </w:tcMar>
-            <w:vAlign w:val="center"/>
-          </w:tcPr>
-          <w:p>
-            <w:pPr>
-              <w:spacing w:after="0" w:line="264" w:lineRule="auto"/>
-            </w:pPr>
-            <w:r>
-              <w:rPr>
-                <w:sz w:val="20"/>
-              </w:rPr>
-              <w:t>INTEGER</w:t>
-            </w:r>
-          </w:p>
-        </w:tc>
-        <w:tc>
-          <w:tcPr>
-            <w:tcW w:w="2929" w:type="dxa"/>
-            <w:tcMar>
-              <w:top w:w="80" w:type="dxa"/>
-              <w:left w:w="80" w:type="dxa"/>
-              <w:bottom w:w="80" w:type="dxa"/>
-              <w:right w:w="80" w:type="dxa"/>
-            </w:tcMar>
-            <w:vAlign w:val="center"/>
-          </w:tcPr>
-          <w:p>
-            <w:pPr>
-              <w:spacing w:after="0" w:line="264" w:lineRule="auto"/>
-            </w:pPr>
-            <w:r>
-              <w:rPr>
-                <w:sz w:val="20"/>
-              </w:rPr>
-              <w:t>Nhịp tim</w:t>
-            </w:r>
-          </w:p>
-        </w:tc>
-      </w:tr>
-      <w:tr>
-        <w:trPr>
-          <w:jc w:val="center"/>
-        </w:trPr>
-        <w:tc>
-          <w:tcPr>
-            <w:tcW w:w="2929" w:type="dxa"/>
-            <w:tcMar>
-              <w:top w:w="80" w:type="dxa"/>
-              <w:left w:w="80" w:type="dxa"/>
-              <w:bottom w:w="80" w:type="dxa"/>
-              <w:right w:w="80" w:type="dxa"/>
-            </w:tcMar>
-            <w:vAlign w:val="center"/>
-          </w:tcPr>
-          <w:p>
-            <w:pPr>
-              <w:spacing w:after="0" w:line="264" w:lineRule="auto"/>
-            </w:pPr>
-            <w:r>
-              <w:rPr>
-                <w:sz w:val="20"/>
-              </w:rPr>
-              <w:t>`spo2`</w:t>
-            </w:r>
-          </w:p>
-        </w:tc>
-        <w:tc>
-          <w:tcPr>
-            <w:tcW w:w="2929" w:type="dxa"/>
-            <w:tcMar>
-              <w:top w:w="80" w:type="dxa"/>
-              <w:left w:w="80" w:type="dxa"/>
-              <w:bottom w:w="80" w:type="dxa"/>
-              <w:right w:w="80" w:type="dxa"/>
-            </w:tcMar>
-            <w:vAlign w:val="center"/>
-          </w:tcPr>
-          <w:p>
-            <w:pPr>
-              <w:spacing w:after="0" w:line="264" w:lineRule="auto"/>
-            </w:pPr>
-            <w:r>
-              <w:rPr>
-                <w:sz w:val="20"/>
-              </w:rPr>
-              <w:t>INTEGER</w:t>
-            </w:r>
-          </w:p>
-        </w:tc>
-        <w:tc>
-          <w:tcPr>
-            <w:tcW w:w="2929" w:type="dxa"/>
-            <w:tcMar>
-              <w:top w:w="80" w:type="dxa"/>
-              <w:left w:w="80" w:type="dxa"/>
-              <w:bottom w:w="80" w:type="dxa"/>
-              <w:right w:w="80" w:type="dxa"/>
-            </w:tcMar>
-            <w:vAlign w:val="center"/>
-          </w:tcPr>
-          <w:p>
-            <w:pPr>
-              <w:spacing w:after="0" w:line="264" w:lineRule="auto"/>
-            </w:pPr>
-            <w:r>
-              <w:rPr>
-                <w:sz w:val="20"/>
-              </w:rPr>
-              <w:t>Nồng độ oxy trong máu</w:t>
             </w:r>
           </w:p>
         </w:tc>
@@ -17191,15 +16504,10 @@
         <w:keepLines/>
       </w:pPr>
       <w:r>
-        <w:t>devices.device_id  ───────&lt;  telemetry.device_id</w:t>
-      </w:r>
-      <w:r>
-        <w:br/>
-      </w:r>
-      <w:r>
-        <w:br/>
-        <w:t>devices.device_id  ───────&lt;  benchmark.device_id</w:t>
-      </w:r>
+        <w:t>devices.device_id ───────&lt; telemetry.device_id devices.device_id ───────&lt; benchmark.device_id</w:t>
+      </w:r>
+      <w:r/>
+      <w:r/>
     </w:p>
     <w:p>
       <w:pPr>
@@ -17504,8 +16812,7 @@
         <w:ind w:left="397" w:hanging="170"/>
       </w:pPr>
       <w:r>
-        <w:lastRenderedPageBreak/>
-        <w:t>Biểu đồ nhịp tim và SpO2.</w:t>
+        <w:t>Biểu đồvà.</w:t>
       </w:r>
     </w:p>
     <w:p>
@@ -17730,84 +17037,27 @@
         <w:keepLines/>
       </w:pPr>
       <w:r>
-        <w:t>Node Xi          Gateway Y          Flask Server          SQLite</w:t>
-      </w:r>
-      <w:r>
-        <w:br/>
-        <w:t xml:space="preserve">   │                 │                    │                  │</w:t>
-      </w:r>
-      <w:r>
-        <w:br/>
-        <w:t xml:space="preserve">   │── Beacon ──────&gt;│                    │                  │</w:t>
-      </w:r>
-      <w:r>
-        <w:br/>
-        <w:t xml:space="preserve">   │&lt;── ACK ─────────│                    │                  │</w:t>
-      </w:r>
-      <w:r>
-        <w:br/>
-        <w:t xml:space="preserve">   │                 │                    │                  │</w:t>
-      </w:r>
-      <w:r>
-        <w:br/>
-        <w:t xml:space="preserve">   │ Tạo dữ liệu     │                    │                  │</w:t>
-      </w:r>
-      <w:r>
-        <w:br/>
-        <w:t xml:space="preserve">   │ Tạo JSON        │                    │                  │</w:t>
-      </w:r>
-      <w:r>
-        <w:br/>
-        <w:t xml:space="preserve">   │ Thêm seq        │                    │                  │</w:t>
-      </w:r>
-      <w:r>
-        <w:br/>
-        <w:t xml:space="preserve">   │ Mã hóa AES      │                    │                  │</w:t>
-      </w:r>
-      <w:r>
-        <w:br/>
-        <w:t xml:space="preserve">   │                 │                    │                  │</w:t>
-      </w:r>
-      <w:r>
-        <w:br/>
-        <w:t xml:space="preserve">   │── Payload ─────&gt;│                    │                  │</w:t>
-      </w:r>
-      <w:r>
-        <w:br/>
-        <w:t xml:space="preserve">   │                 │── HTTP POST ──────&gt;│                  │</w:t>
-      </w:r>
-      <w:r>
-        <w:br/>
-        <w:t xml:space="preserve">   │                 │                    │ Tách IV          │</w:t>
-      </w:r>
-      <w:r>
-        <w:br/>
-        <w:t xml:space="preserve">   │                 │                    │ Giải mã AES      │</w:t>
-      </w:r>
-      <w:r>
-        <w:br/>
-        <w:t xml:space="preserve">   │                 │                    │ Kiểm tra seq     │</w:t>
-      </w:r>
-      <w:r>
-        <w:br/>
-        <w:t xml:space="preserve">   │                 │                    │── INSERT ───────&gt;│</w:t>
-      </w:r>
-      <w:r>
-        <w:br/>
-        <w:t xml:space="preserve">   │                 │                    │── UPDATE seq ───&gt;│</w:t>
-      </w:r>
-      <w:r>
-        <w:br/>
-        <w:t xml:space="preserve">   │                 │                    │&lt;── OK ───────────│</w:t>
-      </w:r>
-      <w:r>
-        <w:br/>
-        <w:t xml:space="preserve">   │                 │&lt;── HTTP 200 ───────│                  │</w:t>
-      </w:r>
-      <w:r>
-        <w:br/>
-        <w:t xml:space="preserve">   │&lt;── Trạng thái ──│                    │                  │</w:t>
-      </w:r>
+        <w:t>Node Xi Gateway Y Flask Server SQLite │ │ │ │ │── Beacon ──────&gt;│ │ │ │&lt;── ACK ─────────│ │ │ │ │ │ │ │ Tạo dữ liệu │ │ │ │ Tạo JSON │ │ │ │ Thêm seq │ │ │ │ Mã hóa AES │ │ │ │ │ │ │ │── Payload ─────&gt;│ │ │ │ │── HTTP POST ──────&gt;│ │ │ │ │ Tách IV │ │ │ │ Giải mã AES │ │ │ │ Kiểm tra seq │ │ │ │── INSERT ───────&gt;│ │ │ │── UPDATE seq ───&gt;│ │ │ │&lt;── OK ───────────│ │ │&lt;── HTTP 200 ───────│ │ │&lt;── Trạng thái ──│ │ │</w:t>
+      </w:r>
+      <w:r/>
+      <w:r/>
+      <w:r/>
+      <w:r/>
+      <w:r/>
+      <w:r/>
+      <w:r/>
+      <w:r/>
+      <w:r/>
+      <w:r/>
+      <w:r/>
+      <w:r/>
+      <w:r/>
+      <w:r/>
+      <w:r/>
+      <w:r/>
+      <w:r/>
+      <w:r/>
+      <w:r/>
     </w:p>
     <w:p>
       <w:pPr>
@@ -17828,52 +17078,19 @@
         <w:keepLines/>
       </w:pPr>
       <w:r>
-        <w:t>Gateway Y          Flask Server          SQLite</w:t>
-      </w:r>
-      <w:r>
-        <w:br/>
-        <w:t xml:space="preserve">   │                    │                  │</w:t>
-      </w:r>
-      <w:r>
-        <w:br/>
-        <w:t xml:space="preserve">   │── HTTP POST ──────&gt;│                  │</w:t>
-      </w:r>
-      <w:r>
-        <w:br/>
-        <w:t xml:space="preserve">   │                    │ Tách IV          │</w:t>
-      </w:r>
-      <w:r>
-        <w:br/>
-        <w:t xml:space="preserve">   │                    │ Giải mã AES      │</w:t>
-      </w:r>
-      <w:r>
-        <w:br/>
-        <w:t xml:space="preserve">   │                    │ Lấy device_id    │</w:t>
-      </w:r>
-      <w:r>
-        <w:br/>
-        <w:t xml:space="preserve">   │                    │ Lấy seq          │</w:t>
-      </w:r>
-      <w:r>
-        <w:br/>
-        <w:t xml:space="preserve">   │                    │── Đọc last_seq ─&gt;│</w:t>
-      </w:r>
-      <w:r>
-        <w:br/>
-        <w:t xml:space="preserve">   │                    │&lt;── last_seq ─────│</w:t>
-      </w:r>
-      <w:r>
-        <w:br/>
-        <w:t xml:space="preserve">   │                    │ So sánh seq      │</w:t>
-      </w:r>
-      <w:r>
-        <w:br/>
-        <w:t xml:space="preserve">   │                    │ Phát hiện replay │</w:t>
-      </w:r>
-      <w:r>
-        <w:br/>
-        <w:t xml:space="preserve">   │&lt;── HTTP Error ─────│                  │</w:t>
-      </w:r>
+        <w:t>Gateway Y Flask Server SQLite │ │ │ │── HTTP POST ──────&gt;│ │ │ │ Tách IV │ │ │ Giải mã AES │ │ │ Lấy device_id │ │ │ Lấy seq │ │ │── Đọc last_seq ─&gt;│ │ │&lt;── last_seq ─────│ │ │ So sánh seq │ │ │ Phát hiện replay │ │&lt;── HTTP Error ─────│ │</w:t>
+      </w:r>
+      <w:r/>
+      <w:r/>
+      <w:r/>
+      <w:r/>
+      <w:r/>
+      <w:r/>
+      <w:r/>
+      <w:r/>
+      <w:r/>
+      <w:r/>
+      <w:r/>
     </w:p>
     <w:p>
       <w:pPr>
@@ -17894,36 +17111,15 @@
         <w:keepLines/>
       </w:pPr>
       <w:r>
-        <w:t>Gateway Y          Flask Server</w:t>
-      </w:r>
-      <w:r>
-        <w:br/>
-        <w:t xml:space="preserve">   │                    │</w:t>
-      </w:r>
-      <w:r>
-        <w:br/>
-        <w:t xml:space="preserve">   │── HTTP POST ──────&gt;│</w:t>
-      </w:r>
-      <w:r>
-        <w:br/>
-        <w:t xml:space="preserve">   │                    │ Kiểm tra payload</w:t>
-      </w:r>
-      <w:r>
-        <w:br/>
-        <w:t xml:space="preserve">   │                    │ Tách IV</w:t>
-      </w:r>
-      <w:r>
-        <w:br/>
-        <w:t xml:space="preserve">   │                    │ Giải mã AES</w:t>
-      </w:r>
-      <w:r>
-        <w:br/>
-        <w:t xml:space="preserve">   │                    │ Giải mã thất bại</w:t>
-      </w:r>
-      <w:r>
-        <w:br/>
-        <w:t xml:space="preserve">   │&lt;── Error response ─│</w:t>
-      </w:r>
+        <w:t>Gateway Y Flask Server │ │ │── HTTP POST ──────&gt;│ │ │ Kiểm tra payload │ │ Tách IV │ │ Giải mã AES │ │ Giải mã thất bại │&lt;── Error response ─│</w:t>
+      </w:r>
+      <w:r/>
+      <w:r/>
+      <w:r/>
+      <w:r/>
+      <w:r/>
+      <w:r/>
+      <w:r/>
     </w:p>
     <w:p>
       <w:pPr>

</xml_diff>

<commit_message>
Hoan thien Chuong 3 - them Bảng 3.1->3.8, clean 3.3.2, cap nhat section labeling; them benchmark_crypto.py + docs/images
</commit_message>
<xml_diff>
--- a/doandocs/Chương 3.docx
+++ b/doandocs/Chương 3.docx
@@ -293,8 +293,14 @@
       <w:pPr>
         <w:pStyle w:val="Heading2"/>
       </w:pPr>
-      <w:r>
-        <w:t>3.2. Mục tiêu thiết kế hệ thống</w:t>
+      <w:r/>
+      <w:r>
+        <w:rPr>
+          <w:rFonts w:ascii="Times New Roman" w:hAnsi="Times New Roman"/>
+          <w:b/>
+          <w:sz w:val="26"/>
+        </w:rPr>
+        <w:t>3.2. Thiết kế kiến trúc hệ thống</w:t>
       </w:r>
     </w:p>
     <w:p>
@@ -452,8 +458,14 @@
       <w:pPr>
         <w:pStyle w:val="Heading4"/>
       </w:pPr>
-      <w:r>
-        <w:t>a. Yêu cầu chức năng của node Xi</w:t>
+      <w:r/>
+      <w:r>
+        <w:rPr>
+          <w:rFonts w:ascii="Times New Roman" w:hAnsi="Times New Roman"/>
+          <w:b/>
+          <w:sz w:val="26"/>
+        </w:rPr>
+        <w:t>3.2.2.1. Chức năng của mô đun IoT cá nhân</w:t>
       </w:r>
     </w:p>
     <w:p>
@@ -1619,8 +1631,14 @@
       <w:pPr>
         <w:pStyle w:val="Heading4"/>
       </w:pPr>
-      <w:r>
-        <w:t>b. Yêu cầu chức năng của Gateway Y</w:t>
+      <w:r/>
+      <w:r>
+        <w:rPr>
+          <w:rFonts w:ascii="Times New Roman" w:hAnsi="Times New Roman"/>
+          <w:b/>
+          <w:sz w:val="26"/>
+        </w:rPr>
+        <w:t>3.2.2.2. Chức năng của mô đun IoT Gateway</w:t>
       </w:r>
     </w:p>
     <w:p>
@@ -2490,8 +2508,14 @@
       <w:pPr>
         <w:pStyle w:val="Heading4"/>
       </w:pPr>
-      <w:r>
-        <w:t>c. Yêu cầu chức năng của Flask Server</w:t>
+      <w:r/>
+      <w:r>
+        <w:rPr>
+          <w:rFonts w:ascii="Times New Roman" w:hAnsi="Times New Roman"/>
+          <w:b/>
+          <w:sz w:val="26"/>
+        </w:rPr>
+        <w:t>3.2.2.3. Chức năng của máy chủ trung tâm</w:t>
       </w:r>
     </w:p>
     <w:p>
@@ -3805,8 +3829,14 @@
       <w:pPr>
         <w:pStyle w:val="Heading4"/>
       </w:pPr>
-      <w:r>
-        <w:t>d. Yêu cầu chức năng của Dashboard</w:t>
+      <w:r/>
+      <w:r>
+        <w:rPr>
+          <w:rFonts w:ascii="Times New Roman" w:hAnsi="Times New Roman"/>
+          <w:b/>
+          <w:sz w:val="26"/>
+        </w:rPr>
+        <w:t>3.2.2.4. Chức năng của Dashboard</w:t>
       </w:r>
     </w:p>
     <w:p>
@@ -4523,10 +4553,17 @@
     </w:p>
     <w:p>
       <w:pPr>
+        <w:pStyle w:val="Heading4"/>
         <w:jc w:val="both"/>
       </w:pPr>
-      <w:r>
-        <w:t>Yêu cầu phi chức năng mô tả cách hệ thống cần hoạt động, thay vì mô tả hệ thống làm gì.</w:t>
+      <w:r/>
+      <w:r>
+        <w:rPr>
+          <w:rFonts w:ascii="Times New Roman" w:hAnsi="Times New Roman"/>
+          <w:b/>
+          <w:sz w:val="26"/>
+        </w:rPr>
+        <w:t>3.2.2.5. Các yêu cầu phi chức năng</w:t>
       </w:r>
     </w:p>
     <w:p>
@@ -5225,10 +5262,16 @@
     </w:p>
     <w:p>
       <w:pPr>
-        <w:pStyle w:val="Heading2"/>
-      </w:pPr>
-      <w:r>
-        <w:t>3.3. Kiến trúc tổng thể của hệ thống</w:t>
+        <w:pStyle w:val="Heading3"/>
+      </w:pPr>
+      <w:r/>
+      <w:r>
+        <w:rPr>
+          <w:rFonts w:ascii="Times New Roman" w:hAnsi="Times New Roman"/>
+          <w:b/>
+          <w:sz w:val="26"/>
+        </w:rPr>
+        <w:t>3.2.1. Kiến trúc tổng thể hệ thống</w:t>
       </w:r>
     </w:p>
     <w:p>
@@ -5556,16 +5599,48 @@
     </w:p>
     <w:p>
       <w:pPr>
+        <w:pStyle w:val="Heading3"/>
+      </w:pPr>
+      <w:r>
+        <w:rPr>
+          <w:rFonts w:ascii="Times New Roman" w:hAnsi="Times New Roman"/>
+          <w:b w:val="0"/>
+          <w:sz w:val="26"/>
+        </w:rPr>
+        <w:t>3.2.2. Phân tích các yêu cầu đối với hệ thống</w:t>
+      </w:r>
+    </w:p>
+    <w:p>
+      <w:pPr>
         <w:pStyle w:val="Heading2"/>
       </w:pPr>
-      <w:r>
-        <w:t>3.4. Thiết kế node Xi</w:t>
+      <w:r/>
+      <w:r>
+        <w:rPr>
+          <w:rFonts w:ascii="Times New Roman" w:hAnsi="Times New Roman"/>
+          <w:b/>
+          <w:sz w:val="26"/>
+        </w:rPr>
+        <w:t>3.3. Thiết kế Node Xi</w:t>
       </w:r>
     </w:p>
     <w:p>
       <w:pPr>
         <w:pStyle w:val="Heading3"/>
       </w:pPr>
+      <w:r>
+        <w:rPr>
+          <w:rFonts w:ascii="Times New Roman" w:hAnsi="Times New Roman"/>
+          <w:b w:val="0"/>
+          <w:sz w:val="26"/>
+        </w:rPr>
+        <w:t>3.3.1. Lựa chọn thiết bị cho Node Xi</w:t>
+      </w:r>
+    </w:p>
+    <w:p>
+      <w:pPr>
+        <w:pStyle w:val="Heading3"/>
+      </w:pPr>
     </w:p>
     <w:p>
       <w:pPr>
@@ -5577,599 +5652,737 @@
     </w:p>
     <w:p>
       <w:pPr>
-        <w:jc w:val="both"/>
-      </w:pPr>
-      <w:r>
-        <w:lastRenderedPageBreak/>
-        <w:t>Node Xi là thành phần quan trọng nhất ở phía thiết bị vì dữ liệu phải được xử lý ngay từ nguồn. Nếu dữ liệu không được mã hóa tại node, dữ liệu có thể bị lộ khi truyền qua môi trường không dây. Vì vậy, node Xi cần thực hiện đầy đủ quá trình tạo JSON, thêm sequence number, mã hóa AES-128-CBC và tạo payload.</w:t>
-      </w:r>
-    </w:p>
-    <w:p>
-      <w:pPr>
         <w:pStyle w:val="Heading3"/>
       </w:pPr>
-    </w:p>
-    <w:p>
-      <w:pPr>
-        <w:jc w:val="both"/>
-      </w:pPr>
-      <w:r>
-        <w:t>Node Xi được chia thành các khối logic sau:</w:t>
+      <w:r>
+        <w:rPr>
+          <w:rFonts w:ascii="Times New Roman" w:hAnsi="Times New Roman"/>
+          <w:b w:val="0"/>
+          <w:sz w:val="26"/>
+        </w:rPr>
+        <w:t>3.3.2. Các thành phần chức năng trong Node Xi</w:t>
+      </w:r>
+    </w:p>
+    <w:p>
+      <w:r>
+        <w:rPr>
+          <w:rFonts w:ascii="Times New Roman" w:hAnsi="Times New Roman"/>
+          <w:sz w:val="26"/>
+        </w:rPr>
+        <w:t>Node Xi cần thực hiện các chức năng liệt kê ở Bảng 3.1 như sau:</w:t>
       </w:r>
     </w:p>
     <w:tbl>
       <w:tblPr>
-        <w:tblStyle w:val="TableGrid"/>
-        <w:tblW w:w="0" w:type="auto"/>
-        <w:jc w:val="center"/>
-        <w:tblLook w:val="04A0" w:firstRow="1" w:lastRow="0" w:firstColumn="1" w:lastColumn="0" w:noHBand="0" w:noVBand="1"/>
+        <w:tblW w:w="5000" w:type="pct"/>
       </w:tblPr>
       <w:tblGrid>
-        <w:gridCol w:w="4389"/>
-        <w:gridCol w:w="4389"/>
+        <w:gridCol w:w="800"/>
+        <w:gridCol w:w="2500"/>
+        <w:gridCol w:w="4200"/>
       </w:tblGrid>
       <w:tr>
         <w:trPr>
-          <w:tblHeader/>
-          <w:jc w:val="center"/>
+          <w:trHeight w:val="400"/>
         </w:trPr>
         <w:tc>
           <w:tcPr>
-            <w:tcW w:w="4394" w:type="dxa"/>
-            <w:shd w:val="clear" w:color="auto" w:fill="D9EAF7"/>
-            <w:tcMar>
-              <w:top w:w="80" w:type="dxa"/>
-              <w:left w:w="80" w:type="dxa"/>
-              <w:bottom w:w="80" w:type="dxa"/>
-              <w:right w:w="80" w:type="dxa"/>
-            </w:tcMar>
-            <w:vAlign w:val="center"/>
-          </w:tcPr>
-          <w:p>
-            <w:pPr>
-              <w:spacing w:after="0" w:line="264" w:lineRule="auto"/>
-            </w:pPr>
-            <w:r>
-              <w:rPr>
+            <w:tcW w:w="800" w:type="dxa"/>
+            <w:tcBorders>
+              <w:top w:val="single" w:sz="4" w:space="0" w:color="000000"/>
+              <w:left w:val="single" w:sz="4" w:space="0" w:color="000000"/>
+              <w:bottom w:val="single" w:sz="4" w:space="0" w:color="000000"/>
+              <w:right w:val="single" w:sz="4" w:space="0" w:color="000000"/>
+            </w:tcBorders>
+          </w:tcPr>
+          <w:p>
+            <w:pPr/>
+            <w:r>
+              <w:rPr>
+                <w:rFonts w:ascii="Times New Roman" w:hAnsi="Times New Roman"/>
+                <w:sz w:val="26"/>
                 <w:b/>
-                <w:sz w:val="20"/>
-              </w:rPr>
-              <w:t>Khối chức năng</w:t>
-            </w:r>
-          </w:p>
-        </w:tc>
-        <w:tc>
-          <w:tcPr>
-            <w:tcW w:w="4394" w:type="dxa"/>
-            <w:shd w:val="clear" w:color="auto" w:fill="D9EAF7"/>
-            <w:tcMar>
-              <w:top w:w="80" w:type="dxa"/>
-              <w:left w:w="80" w:type="dxa"/>
-              <w:bottom w:w="80" w:type="dxa"/>
-              <w:right w:w="80" w:type="dxa"/>
-            </w:tcMar>
-            <w:vAlign w:val="center"/>
-          </w:tcPr>
-          <w:p>
-            <w:pPr>
-              <w:spacing w:after="0" w:line="264" w:lineRule="auto"/>
-            </w:pPr>
-            <w:r>
-              <w:rPr>
+              </w:rPr>
+              <w:t xml:space="preserve">STT</w:t>
+            </w:r>
+          </w:p>
+        </w:tc>
+        <w:tc>
+          <w:tcPr>
+            <w:tcW w:w="2500" w:type="dxa"/>
+            <w:tcBorders>
+              <w:top w:val="single" w:sz="4" w:space="0" w:color="000000"/>
+              <w:left w:val="single" w:sz="4" w:space="0" w:color="000000"/>
+              <w:bottom w:val="single" w:sz="4" w:space="0" w:color="000000"/>
+              <w:right w:val="single" w:sz="4" w:space="0" w:color="000000"/>
+            </w:tcBorders>
+          </w:tcPr>
+          <w:p>
+            <w:pPr/>
+            <w:r>
+              <w:rPr>
+                <w:rFonts w:ascii="Times New Roman" w:hAnsi="Times New Roman"/>
+                <w:sz w:val="26"/>
                 <w:b/>
-                <w:sz w:val="20"/>
-              </w:rPr>
-              <w:t>Nhiệm vụ</w:t>
+              </w:rPr>
+              <w:t xml:space="preserve">Chức năng</w:t>
+            </w:r>
+          </w:p>
+        </w:tc>
+        <w:tc>
+          <w:tcPr>
+            <w:tcW w:w="4200" w:type="dxa"/>
+            <w:tcBorders>
+              <w:top w:val="single" w:sz="4" w:space="0" w:color="000000"/>
+              <w:left w:val="single" w:sz="4" w:space="0" w:color="000000"/>
+              <w:bottom w:val="single" w:sz="4" w:space="0" w:color="000000"/>
+              <w:right w:val="single" w:sz="4" w:space="0" w:color="000000"/>
+            </w:tcBorders>
+          </w:tcPr>
+          <w:p>
+            <w:pPr/>
+            <w:r>
+              <w:rPr>
+                <w:rFonts w:ascii="Times New Roman" w:hAnsi="Times New Roman"/>
+                <w:sz w:val="26"/>
+                <w:b/>
+              </w:rPr>
+              <w:t xml:space="preserve">Mô tả</w:t>
             </w:r>
           </w:p>
         </w:tc>
       </w:tr>
       <w:tr>
         <w:trPr>
-          <w:jc w:val="center"/>
+          <w:trHeight w:val="400"/>
         </w:trPr>
         <w:tc>
           <w:tcPr>
-            <w:tcW w:w="4394" w:type="dxa"/>
-            <w:tcMar>
-              <w:top w:w="80" w:type="dxa"/>
-              <w:left w:w="80" w:type="dxa"/>
-              <w:bottom w:w="80" w:type="dxa"/>
-              <w:right w:w="80" w:type="dxa"/>
-            </w:tcMar>
-            <w:vAlign w:val="center"/>
-          </w:tcPr>
-          <w:p>
-            <w:pPr>
-              <w:spacing w:after="0" w:line="264" w:lineRule="auto"/>
-            </w:pPr>
-            <w:r>
-              <w:rPr>
-                <w:sz w:val="20"/>
-              </w:rPr>
-              <w:t>Khối cấu hình</w:t>
-            </w:r>
-          </w:p>
-        </w:tc>
-        <w:tc>
-          <w:tcPr>
-            <w:tcW w:w="4394" w:type="dxa"/>
-            <w:tcMar>
-              <w:top w:w="80" w:type="dxa"/>
-              <w:left w:w="80" w:type="dxa"/>
-              <w:bottom w:w="80" w:type="dxa"/>
-              <w:right w:w="80" w:type="dxa"/>
-            </w:tcMar>
-            <w:vAlign w:val="center"/>
-          </w:tcPr>
-          <w:p>
-            <w:pPr>
-              <w:spacing w:after="0" w:line="264" w:lineRule="auto"/>
-            </w:pPr>
-            <w:r>
-              <w:rPr>
-                <w:sz w:val="20"/>
-              </w:rPr>
-              <w:t>Lưu mã node, khóa AES, chu kỳ gửi, địa chỉ Gateway</w:t>
+            <w:tcW w:w="800" w:type="dxa"/>
+            <w:tcBorders>
+              <w:top w:val="single" w:sz="4" w:space="0" w:color="000000"/>
+              <w:left w:val="single" w:sz="4" w:space="0" w:color="000000"/>
+              <w:bottom w:val="single" w:sz="4" w:space="0" w:color="000000"/>
+              <w:right w:val="single" w:sz="4" w:space="0" w:color="000000"/>
+            </w:tcBorders>
+          </w:tcPr>
+          <w:p>
+            <w:pPr/>
+            <w:r>
+              <w:rPr>
+                <w:rFonts w:ascii="Times New Roman" w:hAnsi="Times New Roman"/>
+                <w:sz w:val="26"/>
+              </w:rPr>
+              <w:t xml:space="preserve">1</w:t>
+            </w:r>
+          </w:p>
+        </w:tc>
+        <w:tc>
+          <w:tcPr>
+            <w:tcW w:w="2500" w:type="dxa"/>
+            <w:tcBorders>
+              <w:top w:val="single" w:sz="4" w:space="0" w:color="000000"/>
+              <w:left w:val="single" w:sz="4" w:space="0" w:color="000000"/>
+              <w:bottom w:val="single" w:sz="4" w:space="0" w:color="000000"/>
+              <w:right w:val="single" w:sz="4" w:space="0" w:color="000000"/>
+            </w:tcBorders>
+          </w:tcPr>
+          <w:p>
+            <w:pPr/>
+            <w:r>
+              <w:rPr>
+                <w:rFonts w:ascii="Times New Roman" w:hAnsi="Times New Roman"/>
+                <w:sz w:val="26"/>
+              </w:rPr>
+              <w:t xml:space="preserve">Thu thập dữ liệu</w:t>
+            </w:r>
+          </w:p>
+        </w:tc>
+        <w:tc>
+          <w:tcPr>
+            <w:tcW w:w="4200" w:type="dxa"/>
+            <w:tcBorders>
+              <w:top w:val="single" w:sz="4" w:space="0" w:color="000000"/>
+              <w:left w:val="single" w:sz="4" w:space="0" w:color="000000"/>
+              <w:bottom w:val="single" w:sz="4" w:space="0" w:color="000000"/>
+              <w:right w:val="single" w:sz="4" w:space="0" w:color="000000"/>
+            </w:tcBorders>
+          </w:tcPr>
+          <w:p>
+            <w:pPr/>
+            <w:r>
+              <w:rPr>
+                <w:rFonts w:ascii="Times New Roman" w:hAnsi="Times New Roman"/>
+                <w:sz w:val="26"/>
+              </w:rPr>
+              <w:t xml:space="preserve">Đọc dữ liệu từ cảm biến (nhiệt độ, độ ẩm, áp suất, CO, CO2, NH3) và GPS</w:t>
             </w:r>
           </w:p>
         </w:tc>
       </w:tr>
       <w:tr>
         <w:trPr>
-          <w:jc w:val="center"/>
+          <w:trHeight w:val="400"/>
         </w:trPr>
         <w:tc>
           <w:tcPr>
-            <w:tcW w:w="4394" w:type="dxa"/>
-            <w:tcMar>
-              <w:top w:w="80" w:type="dxa"/>
-              <w:left w:w="80" w:type="dxa"/>
-              <w:bottom w:w="80" w:type="dxa"/>
-              <w:right w:w="80" w:type="dxa"/>
-            </w:tcMar>
-            <w:vAlign w:val="center"/>
-          </w:tcPr>
-          <w:p>
-            <w:pPr>
-              <w:spacing w:after="0" w:line="264" w:lineRule="auto"/>
-            </w:pPr>
-            <w:r>
-              <w:rPr>
-                <w:sz w:val="20"/>
-              </w:rPr>
-              <w:t>Khối Beacon</w:t>
-            </w:r>
-          </w:p>
-        </w:tc>
-        <w:tc>
-          <w:tcPr>
-            <w:tcW w:w="4394" w:type="dxa"/>
-            <w:tcMar>
-              <w:top w:w="80" w:type="dxa"/>
-              <w:left w:w="80" w:type="dxa"/>
-              <w:bottom w:w="80" w:type="dxa"/>
-              <w:right w:w="80" w:type="dxa"/>
-            </w:tcMar>
-            <w:vAlign w:val="center"/>
-          </w:tcPr>
-          <w:p>
-            <w:pPr>
-              <w:spacing w:after="0" w:line="264" w:lineRule="auto"/>
-            </w:pPr>
-            <w:r>
-              <w:rPr>
-                <w:sz w:val="20"/>
-              </w:rPr>
-              <w:t>Tạo và gửi Beacon</w:t>
+            <w:tcW w:w="800" w:type="dxa"/>
+            <w:tcBorders>
+              <w:top w:val="single" w:sz="4" w:space="0" w:color="000000"/>
+              <w:left w:val="single" w:sz="4" w:space="0" w:color="000000"/>
+              <w:bottom w:val="single" w:sz="4" w:space="0" w:color="000000"/>
+              <w:right w:val="single" w:sz="4" w:space="0" w:color="000000"/>
+            </w:tcBorders>
+          </w:tcPr>
+          <w:p>
+            <w:pPr/>
+            <w:r>
+              <w:rPr>
+                <w:rFonts w:ascii="Times New Roman" w:hAnsi="Times New Roman"/>
+                <w:sz w:val="26"/>
+              </w:rPr>
+              <w:t xml:space="preserve">2</w:t>
+            </w:r>
+          </w:p>
+        </w:tc>
+        <w:tc>
+          <w:tcPr>
+            <w:tcW w:w="2500" w:type="dxa"/>
+            <w:tcBorders>
+              <w:top w:val="single" w:sz="4" w:space="0" w:color="000000"/>
+              <w:left w:val="single" w:sz="4" w:space="0" w:color="000000"/>
+              <w:bottom w:val="single" w:sz="4" w:space="0" w:color="000000"/>
+              <w:right w:val="single" w:sz="4" w:space="0" w:color="000000"/>
+            </w:tcBorders>
+          </w:tcPr>
+          <w:p>
+            <w:pPr/>
+            <w:r>
+              <w:rPr>
+                <w:rFonts w:ascii="Times New Roman" w:hAnsi="Times New Roman"/>
+                <w:sz w:val="26"/>
+              </w:rPr>
+              <w:t xml:space="preserve">Phát Beacon</w:t>
+            </w:r>
+          </w:p>
+        </w:tc>
+        <w:tc>
+          <w:tcPr>
+            <w:tcW w:w="4200" w:type="dxa"/>
+            <w:tcBorders>
+              <w:top w:val="single" w:sz="4" w:space="0" w:color="000000"/>
+              <w:left w:val="single" w:sz="4" w:space="0" w:color="000000"/>
+              <w:bottom w:val="single" w:sz="4" w:space="0" w:color="000000"/>
+              <w:right w:val="single" w:sz="4" w:space="0" w:color="000000"/>
+            </w:tcBorders>
+          </w:tcPr>
+          <w:p>
+            <w:pPr/>
+            <w:r>
+              <w:rPr>
+                <w:rFonts w:ascii="Times New Roman" w:hAnsi="Times New Roman"/>
+                <w:sz w:val="26"/>
+              </w:rPr>
+              <w:t xml:space="preserve">Gửi gói tin B|&lt;Xi_ID&gt; định kỳ để Gateway phát hiện sự có mặt</w:t>
             </w:r>
           </w:p>
         </w:tc>
       </w:tr>
       <w:tr>
         <w:trPr>
-          <w:jc w:val="center"/>
+          <w:trHeight w:val="400"/>
         </w:trPr>
         <w:tc>
           <w:tcPr>
-            <w:tcW w:w="4394" w:type="dxa"/>
-            <w:tcMar>
-              <w:top w:w="80" w:type="dxa"/>
-              <w:left w:w="80" w:type="dxa"/>
-              <w:bottom w:w="80" w:type="dxa"/>
-              <w:right w:w="80" w:type="dxa"/>
-            </w:tcMar>
-            <w:vAlign w:val="center"/>
-          </w:tcPr>
-          <w:p>
-            <w:pPr>
-              <w:spacing w:after="0" w:line="264" w:lineRule="auto"/>
-            </w:pPr>
-            <w:r>
-              <w:rPr>
-                <w:sz w:val="20"/>
-              </w:rPr>
-              <w:t>Khối ACK</w:t>
-            </w:r>
-          </w:p>
-        </w:tc>
-        <w:tc>
-          <w:tcPr>
-            <w:tcW w:w="4394" w:type="dxa"/>
-            <w:tcMar>
-              <w:top w:w="80" w:type="dxa"/>
-              <w:left w:w="80" w:type="dxa"/>
-              <w:bottom w:w="80" w:type="dxa"/>
-              <w:right w:w="80" w:type="dxa"/>
-            </w:tcMar>
-            <w:vAlign w:val="center"/>
-          </w:tcPr>
-          <w:p>
-            <w:pPr>
-              <w:spacing w:after="0" w:line="264" w:lineRule="auto"/>
-            </w:pPr>
-            <w:r>
-              <w:rPr>
-                <w:sz w:val="20"/>
-              </w:rPr>
-              <w:t>Nhận và kiểm tra ACK từ Gateway</w:t>
+            <w:tcW w:w="800" w:type="dxa"/>
+            <w:tcBorders>
+              <w:top w:val="single" w:sz="4" w:space="0" w:color="000000"/>
+              <w:left w:val="single" w:sz="4" w:space="0" w:color="000000"/>
+              <w:bottom w:val="single" w:sz="4" w:space="0" w:color="000000"/>
+              <w:right w:val="single" w:sz="4" w:space="0" w:color="000000"/>
+            </w:tcBorders>
+          </w:tcPr>
+          <w:p>
+            <w:pPr/>
+            <w:r>
+              <w:rPr>
+                <w:rFonts w:ascii="Times New Roman" w:hAnsi="Times New Roman"/>
+                <w:sz w:val="26"/>
+              </w:rPr>
+              <w:t xml:space="preserve">3</w:t>
+            </w:r>
+          </w:p>
+        </w:tc>
+        <w:tc>
+          <w:tcPr>
+            <w:tcW w:w="2500" w:type="dxa"/>
+            <w:tcBorders>
+              <w:top w:val="single" w:sz="4" w:space="0" w:color="000000"/>
+              <w:left w:val="single" w:sz="4" w:space="0" w:color="000000"/>
+              <w:bottom w:val="single" w:sz="4" w:space="0" w:color="000000"/>
+              <w:right w:val="single" w:sz="4" w:space="0" w:color="000000"/>
+            </w:tcBorders>
+          </w:tcPr>
+          <w:p>
+            <w:pPr/>
+            <w:r>
+              <w:rPr>
+                <w:rFonts w:ascii="Times New Roman" w:hAnsi="Times New Roman"/>
+                <w:sz w:val="26"/>
+              </w:rPr>
+              <w:t xml:space="preserve">Nhận ACK</w:t>
+            </w:r>
+          </w:p>
+        </w:tc>
+        <w:tc>
+          <w:tcPr>
+            <w:tcW w:w="4200" w:type="dxa"/>
+            <w:tcBorders>
+              <w:top w:val="single" w:sz="4" w:space="0" w:color="000000"/>
+              <w:left w:val="single" w:sz="4" w:space="0" w:color="000000"/>
+              <w:bottom w:val="single" w:sz="4" w:space="0" w:color="000000"/>
+              <w:right w:val="single" w:sz="4" w:space="0" w:color="000000"/>
+            </w:tcBorders>
+          </w:tcPr>
+          <w:p>
+            <w:pPr/>
+            <w:r>
+              <w:rPr>
+                <w:rFonts w:ascii="Times New Roman" w:hAnsi="Times New Roman"/>
+                <w:sz w:val="26"/>
+              </w:rPr>
+              <w:t xml:space="preserve">Nhận phản hồi A|&lt;Xi_ID&gt;|&lt;Y_ID&gt; từ Gateway</w:t>
             </w:r>
           </w:p>
         </w:tc>
       </w:tr>
       <w:tr>
         <w:trPr>
-          <w:jc w:val="center"/>
+          <w:trHeight w:val="400"/>
         </w:trPr>
         <w:tc>
           <w:tcPr>
-            <w:tcW w:w="4394" w:type="dxa"/>
-            <w:tcMar>
-              <w:top w:w="80" w:type="dxa"/>
-              <w:left w:w="80" w:type="dxa"/>
-              <w:bottom w:w="80" w:type="dxa"/>
-              <w:right w:w="80" w:type="dxa"/>
-            </w:tcMar>
-            <w:vAlign w:val="center"/>
-          </w:tcPr>
-          <w:p>
-            <w:pPr>
-              <w:spacing w:after="0" w:line="264" w:lineRule="auto"/>
-            </w:pPr>
-            <w:r>
-              <w:rPr>
-                <w:sz w:val="20"/>
-              </w:rPr>
-              <w:t>Khối cảm biến</w:t>
-            </w:r>
-          </w:p>
-        </w:tc>
-        <w:tc>
-          <w:tcPr>
-            <w:tcW w:w="4394" w:type="dxa"/>
-            <w:tcMar>
-              <w:top w:w="80" w:type="dxa"/>
-              <w:left w:w="80" w:type="dxa"/>
-              <w:bottom w:w="80" w:type="dxa"/>
-              <w:right w:w="80" w:type="dxa"/>
-            </w:tcMar>
-            <w:vAlign w:val="center"/>
-          </w:tcPr>
-          <w:p>
-            <w:pPr>
-              <w:spacing w:after="0" w:line="264" w:lineRule="auto"/>
-            </w:pPr>
-            <w:r>
-              <w:rPr>
-                <w:sz w:val="20"/>
-              </w:rPr>
-              <w:t>Tạo hoặc đọc dữ liệu cảm biến</w:t>
+            <w:tcW w:w="800" w:type="dxa"/>
+            <w:tcBorders>
+              <w:top w:val="single" w:sz="4" w:space="0" w:color="000000"/>
+              <w:left w:val="single" w:sz="4" w:space="0" w:color="000000"/>
+              <w:bottom w:val="single" w:sz="4" w:space="0" w:color="000000"/>
+              <w:right w:val="single" w:sz="4" w:space="0" w:color="000000"/>
+            </w:tcBorders>
+          </w:tcPr>
+          <w:p>
+            <w:pPr/>
+            <w:r>
+              <w:rPr>
+                <w:rFonts w:ascii="Times New Roman" w:hAnsi="Times New Roman"/>
+                <w:sz w:val="26"/>
+              </w:rPr>
+              <w:t xml:space="preserve">4</w:t>
+            </w:r>
+          </w:p>
+        </w:tc>
+        <w:tc>
+          <w:tcPr>
+            <w:tcW w:w="2500" w:type="dxa"/>
+            <w:tcBorders>
+              <w:top w:val="single" w:sz="4" w:space="0" w:color="000000"/>
+              <w:left w:val="single" w:sz="4" w:space="0" w:color="000000"/>
+              <w:bottom w:val="single" w:sz="4" w:space="0" w:color="000000"/>
+              <w:right w:val="single" w:sz="4" w:space="0" w:color="000000"/>
+            </w:tcBorders>
+          </w:tcPr>
+          <w:p>
+            <w:pPr/>
+            <w:r>
+              <w:rPr>
+                <w:rFonts w:ascii="Times New Roman" w:hAnsi="Times New Roman"/>
+                <w:sz w:val="26"/>
+              </w:rPr>
+              <w:t xml:space="preserve">Mã hóa dữ liệu</w:t>
+            </w:r>
+          </w:p>
+        </w:tc>
+        <w:tc>
+          <w:tcPr>
+            <w:tcW w:w="4200" w:type="dxa"/>
+            <w:tcBorders>
+              <w:top w:val="single" w:sz="4" w:space="0" w:color="000000"/>
+              <w:left w:val="single" w:sz="4" w:space="0" w:color="000000"/>
+              <w:bottom w:val="single" w:sz="4" w:space="0" w:color="000000"/>
+              <w:right w:val="single" w:sz="4" w:space="0" w:color="000000"/>
+            </w:tcBorders>
+          </w:tcPr>
+          <w:p>
+            <w:pPr/>
+            <w:r>
+              <w:rPr>
+                <w:rFonts w:ascii="Times New Roman" w:hAnsi="Times New Roman"/>
+                <w:sz w:val="26"/>
+              </w:rPr>
+              <w:t xml:space="preserve">Tạo JSON, mã hóa AES-128-CBC, gắn sequence number</w:t>
             </w:r>
           </w:p>
         </w:tc>
       </w:tr>
       <w:tr>
         <w:trPr>
-          <w:jc w:val="center"/>
+          <w:trHeight w:val="400"/>
         </w:trPr>
         <w:tc>
           <w:tcPr>
-            <w:tcW w:w="4394" w:type="dxa"/>
-            <w:tcMar>
-              <w:top w:w="80" w:type="dxa"/>
-              <w:left w:w="80" w:type="dxa"/>
-              <w:bottom w:w="80" w:type="dxa"/>
-              <w:right w:w="80" w:type="dxa"/>
-            </w:tcMar>
-            <w:vAlign w:val="center"/>
-          </w:tcPr>
-          <w:p>
-            <w:pPr>
-              <w:spacing w:after="0" w:line="264" w:lineRule="auto"/>
-            </w:pPr>
-            <w:r>
-              <w:rPr>
-                <w:sz w:val="20"/>
-              </w:rPr>
-              <w:t>Khối GPS</w:t>
-            </w:r>
-          </w:p>
-        </w:tc>
-        <w:tc>
-          <w:tcPr>
-            <w:tcW w:w="4394" w:type="dxa"/>
-            <w:tcMar>
-              <w:top w:w="80" w:type="dxa"/>
-              <w:left w:w="80" w:type="dxa"/>
-              <w:bottom w:w="80" w:type="dxa"/>
-              <w:right w:w="80" w:type="dxa"/>
-            </w:tcMar>
-            <w:vAlign w:val="center"/>
-          </w:tcPr>
-          <w:p>
-            <w:pPr>
-              <w:spacing w:after="0" w:line="264" w:lineRule="auto"/>
-            </w:pPr>
-            <w:r>
-              <w:rPr>
-                <w:sz w:val="20"/>
-              </w:rPr>
-              <w:t>Tạo hoặc đọc dữ liệu vị trí</w:t>
+            <w:tcW w:w="800" w:type="dxa"/>
+            <w:tcBorders>
+              <w:top w:val="single" w:sz="4" w:space="0" w:color="000000"/>
+              <w:left w:val="single" w:sz="4" w:space="0" w:color="000000"/>
+              <w:bottom w:val="single" w:sz="4" w:space="0" w:color="000000"/>
+              <w:right w:val="single" w:sz="4" w:space="0" w:color="000000"/>
+            </w:tcBorders>
+          </w:tcPr>
+          <w:p>
+            <w:pPr/>
+            <w:r>
+              <w:rPr>
+                <w:rFonts w:ascii="Times New Roman" w:hAnsi="Times New Roman"/>
+                <w:sz w:val="26"/>
+              </w:rPr>
+              <w:t xml:space="preserve">5</w:t>
+            </w:r>
+          </w:p>
+        </w:tc>
+        <w:tc>
+          <w:tcPr>
+            <w:tcW w:w="2500" w:type="dxa"/>
+            <w:tcBorders>
+              <w:top w:val="single" w:sz="4" w:space="0" w:color="000000"/>
+              <w:left w:val="single" w:sz="4" w:space="0" w:color="000000"/>
+              <w:bottom w:val="single" w:sz="4" w:space="0" w:color="000000"/>
+              <w:right w:val="single" w:sz="4" w:space="0" w:color="000000"/>
+            </w:tcBorders>
+          </w:tcPr>
+          <w:p>
+            <w:pPr/>
+            <w:r>
+              <w:rPr>
+                <w:rFonts w:ascii="Times New Roman" w:hAnsi="Times New Roman"/>
+                <w:sz w:val="26"/>
+              </w:rPr>
+              <w:t xml:space="preserve">Chống phát lại</w:t>
+            </w:r>
+          </w:p>
+        </w:tc>
+        <w:tc>
+          <w:tcPr>
+            <w:tcW w:w="4200" w:type="dxa"/>
+            <w:tcBorders>
+              <w:top w:val="single" w:sz="4" w:space="0" w:color="000000"/>
+              <w:left w:val="single" w:sz="4" w:space="0" w:color="000000"/>
+              <w:bottom w:val="single" w:sz="4" w:space="0" w:color="000000"/>
+              <w:right w:val="single" w:sz="4" w:space="0" w:color="000000"/>
+            </w:tcBorders>
+          </w:tcPr>
+          <w:p>
+            <w:pPr/>
+            <w:r>
+              <w:rPr>
+                <w:rFonts w:ascii="Times New Roman" w:hAnsi="Times New Roman"/>
+                <w:sz w:val="26"/>
+              </w:rPr>
+              <w:t xml:space="preserve">Gắn sequence number tăng dần vào mỗi gói tin</w:t>
+            </w:r>
+          </w:p>
+        </w:tc>
+      </w:tr>
+    </w:tbl>
+    <w:p/>
+    <w:p>
+      <w:r>
+        <w:rPr>
+          <w:rFonts w:ascii="Times New Roman" w:hAnsi="Times New Roman"/>
+          <w:sz w:val="26"/>
+        </w:rPr>
+        <w:t>Để thực hiện các chức năng trên, các khối logic được thiết kế cho Node Xi được thể hiện trong Bảng 3.2 như sau:</w:t>
+      </w:r>
+    </w:p>
+    <w:tbl>
+      <w:tblPr>
+        <w:tblW w:w="5000" w:type="pct"/>
+      </w:tblPr>
+      <w:tblGrid>
+        <w:gridCol w:w="800"/>
+        <w:gridCol w:w="2500"/>
+        <w:gridCol w:w="4200"/>
+      </w:tblGrid>
+      <w:tr>
+        <w:trPr>
+          <w:trHeight w:val="400"/>
+        </w:trPr>
+        <w:tc>
+          <w:tcPr>
+            <w:tcW w:w="800" w:type="dxa"/>
+            <w:tcBorders>
+              <w:top w:val="single" w:sz="4" w:space="0" w:color="000000"/>
+              <w:left w:val="single" w:sz="4" w:space="0" w:color="000000"/>
+              <w:bottom w:val="single" w:sz="4" w:space="0" w:color="000000"/>
+              <w:right w:val="single" w:sz="4" w:space="0" w:color="000000"/>
+            </w:tcBorders>
+          </w:tcPr>
+          <w:p>
+            <w:pPr/>
+            <w:r>
+              <w:rPr>
+                <w:rFonts w:ascii="Times New Roman" w:hAnsi="Times New Roman"/>
+                <w:sz w:val="26"/>
+                <w:b/>
+              </w:rPr>
+              <w:t xml:space="preserve">STT</w:t>
+            </w:r>
+          </w:p>
+        </w:tc>
+        <w:tc>
+          <w:tcPr>
+            <w:tcW w:w="2500" w:type="dxa"/>
+            <w:tcBorders>
+              <w:top w:val="single" w:sz="4" w:space="0" w:color="000000"/>
+              <w:left w:val="single" w:sz="4" w:space="0" w:color="000000"/>
+              <w:bottom w:val="single" w:sz="4" w:space="0" w:color="000000"/>
+              <w:right w:val="single" w:sz="4" w:space="0" w:color="000000"/>
+            </w:tcBorders>
+          </w:tcPr>
+          <w:p>
+            <w:pPr/>
+            <w:r>
+              <w:rPr>
+                <w:rFonts w:ascii="Times New Roman" w:hAnsi="Times New Roman"/>
+                <w:sz w:val="26"/>
+                <w:b/>
+              </w:rPr>
+              <w:t xml:space="preserve">Khối</w:t>
+            </w:r>
+          </w:p>
+        </w:tc>
+        <w:tc>
+          <w:tcPr>
+            <w:tcW w:w="4200" w:type="dxa"/>
+            <w:tcBorders>
+              <w:top w:val="single" w:sz="4" w:space="0" w:color="000000"/>
+              <w:left w:val="single" w:sz="4" w:space="0" w:color="000000"/>
+              <w:bottom w:val="single" w:sz="4" w:space="0" w:color="000000"/>
+              <w:right w:val="single" w:sz="4" w:space="0" w:color="000000"/>
+            </w:tcBorders>
+          </w:tcPr>
+          <w:p>
+            <w:pPr/>
+            <w:r>
+              <w:rPr>
+                <w:rFonts w:ascii="Times New Roman" w:hAnsi="Times New Roman"/>
+                <w:sz w:val="26"/>
+                <w:b/>
+              </w:rPr>
+              <w:t xml:space="preserve">Chức năng</w:t>
             </w:r>
           </w:p>
         </w:tc>
       </w:tr>
       <w:tr>
         <w:trPr>
-          <w:jc w:val="center"/>
+          <w:trHeight w:val="400"/>
         </w:trPr>
         <w:tc>
           <w:tcPr>
-            <w:tcW w:w="4394" w:type="dxa"/>
-            <w:tcMar>
-              <w:top w:w="80" w:type="dxa"/>
-              <w:left w:w="80" w:type="dxa"/>
-              <w:bottom w:w="80" w:type="dxa"/>
-              <w:right w:w="80" w:type="dxa"/>
-            </w:tcMar>
-            <w:vAlign w:val="center"/>
-          </w:tcPr>
-          <w:p>
-            <w:pPr>
-              <w:spacing w:after="0" w:line="264" w:lineRule="auto"/>
-            </w:pPr>
-            <w:r>
-              <w:rPr>
-                <w:sz w:val="20"/>
-              </w:rPr>
-              <w:t>Khối JSON</w:t>
-            </w:r>
-          </w:p>
-        </w:tc>
-        <w:tc>
-          <w:tcPr>
-            <w:tcW w:w="4394" w:type="dxa"/>
-            <w:tcMar>
-              <w:top w:w="80" w:type="dxa"/>
-              <w:left w:w="80" w:type="dxa"/>
-              <w:bottom w:w="80" w:type="dxa"/>
-              <w:right w:w="80" w:type="dxa"/>
-            </w:tcMar>
-            <w:vAlign w:val="center"/>
-          </w:tcPr>
-          <w:p>
-            <w:pPr>
-              <w:spacing w:after="0" w:line="264" w:lineRule="auto"/>
-            </w:pPr>
-            <w:r>
-              <w:rPr>
-                <w:sz w:val="20"/>
-              </w:rPr>
-              <w:t>Đóng gói dữ liệu thành JSON</w:t>
+            <w:tcW w:w="800" w:type="dxa"/>
+            <w:tcBorders>
+              <w:top w:val="single" w:sz="4" w:space="0" w:color="000000"/>
+              <w:left w:val="single" w:sz="4" w:space="0" w:color="000000"/>
+              <w:bottom w:val="single" w:sz="4" w:space="0" w:color="000000"/>
+              <w:right w:val="single" w:sz="4" w:space="0" w:color="000000"/>
+            </w:tcBorders>
+          </w:tcPr>
+          <w:p>
+            <w:pPr/>
+            <w:r>
+              <w:rPr>
+                <w:rFonts w:ascii="Times New Roman" w:hAnsi="Times New Roman"/>
+                <w:sz w:val="26"/>
+              </w:rPr>
+              <w:t xml:space="preserve">1</w:t>
+            </w:r>
+          </w:p>
+        </w:tc>
+        <w:tc>
+          <w:tcPr>
+            <w:tcW w:w="2500" w:type="dxa"/>
+            <w:tcBorders>
+              <w:top w:val="single" w:sz="4" w:space="0" w:color="000000"/>
+              <w:left w:val="single" w:sz="4" w:space="0" w:color="000000"/>
+              <w:bottom w:val="single" w:sz="4" w:space="0" w:color="000000"/>
+              <w:right w:val="single" w:sz="4" w:space="0" w:color="000000"/>
+            </w:tcBorders>
+          </w:tcPr>
+          <w:p>
+            <w:pPr/>
+            <w:r>
+              <w:rPr>
+                <w:rFonts w:ascii="Times New Roman" w:hAnsi="Times New Roman"/>
+                <w:sz w:val="26"/>
+              </w:rPr>
+              <w:t xml:space="preserve">Khối đầu vào</w:t>
+            </w:r>
+          </w:p>
+        </w:tc>
+        <w:tc>
+          <w:tcPr>
+            <w:tcW w:w="4200" w:type="dxa"/>
+            <w:tcBorders>
+              <w:top w:val="single" w:sz="4" w:space="0" w:color="000000"/>
+              <w:left w:val="single" w:sz="4" w:space="0" w:color="000000"/>
+              <w:bottom w:val="single" w:sz="4" w:space="0" w:color="000000"/>
+              <w:right w:val="single" w:sz="4" w:space="0" w:color="000000"/>
+            </w:tcBorders>
+          </w:tcPr>
+          <w:p>
+            <w:pPr/>
+            <w:r>
+              <w:rPr>
+                <w:rFonts w:ascii="Times New Roman" w:hAnsi="Times New Roman"/>
+                <w:sz w:val="26"/>
+              </w:rPr>
+              <w:t xml:space="preserve">Tiếp nhận mã định danh node, mã Gateway, khóa AES, dữ liệu cảm biến, GPS, ACK, sequence number</w:t>
             </w:r>
           </w:p>
         </w:tc>
       </w:tr>
       <w:tr>
         <w:trPr>
-          <w:jc w:val="center"/>
+          <w:trHeight w:val="400"/>
         </w:trPr>
         <w:tc>
           <w:tcPr>
-            <w:tcW w:w="4394" w:type="dxa"/>
-            <w:tcMar>
-              <w:top w:w="80" w:type="dxa"/>
-              <w:left w:w="80" w:type="dxa"/>
-              <w:bottom w:w="80" w:type="dxa"/>
-              <w:right w:w="80" w:type="dxa"/>
-            </w:tcMar>
-            <w:vAlign w:val="center"/>
-          </w:tcPr>
-          <w:p>
-            <w:pPr>
-              <w:spacing w:after="0" w:line="264" w:lineRule="auto"/>
-            </w:pPr>
-            <w:r>
-              <w:rPr>
-                <w:sz w:val="20"/>
-              </w:rPr>
-              <w:t>Khối sequence</w:t>
-            </w:r>
-          </w:p>
-        </w:tc>
-        <w:tc>
-          <w:tcPr>
-            <w:tcW w:w="4394" w:type="dxa"/>
-            <w:tcMar>
-              <w:top w:w="80" w:type="dxa"/>
-              <w:left w:w="80" w:type="dxa"/>
-              <w:bottom w:w="80" w:type="dxa"/>
-              <w:right w:w="80" w:type="dxa"/>
-            </w:tcMar>
-            <w:vAlign w:val="center"/>
-          </w:tcPr>
-          <w:p>
-            <w:pPr>
-              <w:spacing w:after="0" w:line="264" w:lineRule="auto"/>
-            </w:pPr>
-            <w:r>
-              <w:rPr>
-                <w:sz w:val="20"/>
-              </w:rPr>
-              <w:t>Quản lý sequence number</w:t>
+            <w:tcW w:w="800" w:type="dxa"/>
+            <w:tcBorders>
+              <w:top w:val="single" w:sz="4" w:space="0" w:color="000000"/>
+              <w:left w:val="single" w:sz="4" w:space="0" w:color="000000"/>
+              <w:bottom w:val="single" w:sz="4" w:space="0" w:color="000000"/>
+              <w:right w:val="single" w:sz="4" w:space="0" w:color="000000"/>
+            </w:tcBorders>
+          </w:tcPr>
+          <w:p>
+            <w:pPr/>
+            <w:r>
+              <w:rPr>
+                <w:rFonts w:ascii="Times New Roman" w:hAnsi="Times New Roman"/>
+                <w:sz w:val="26"/>
+              </w:rPr>
+              <w:t xml:space="preserve">2</w:t>
+            </w:r>
+          </w:p>
+        </w:tc>
+        <w:tc>
+          <w:tcPr>
+            <w:tcW w:w="2500" w:type="dxa"/>
+            <w:tcBorders>
+              <w:top w:val="single" w:sz="4" w:space="0" w:color="000000"/>
+              <w:left w:val="single" w:sz="4" w:space="0" w:color="000000"/>
+              <w:bottom w:val="single" w:sz="4" w:space="0" w:color="000000"/>
+              <w:right w:val="single" w:sz="4" w:space="0" w:color="000000"/>
+            </w:tcBorders>
+          </w:tcPr>
+          <w:p>
+            <w:pPr/>
+            <w:r>
+              <w:rPr>
+                <w:rFonts w:ascii="Times New Roman" w:hAnsi="Times New Roman"/>
+                <w:sz w:val="26"/>
+              </w:rPr>
+              <w:t xml:space="preserve">Khối xử lý</w:t>
+            </w:r>
+          </w:p>
+        </w:tc>
+        <w:tc>
+          <w:tcPr>
+            <w:tcW w:w="4200" w:type="dxa"/>
+            <w:tcBorders>
+              <w:top w:val="single" w:sz="4" w:space="0" w:color="000000"/>
+              <w:left w:val="single" w:sz="4" w:space="0" w:color="000000"/>
+              <w:bottom w:val="single" w:sz="4" w:space="0" w:color="000000"/>
+              <w:right w:val="single" w:sz="4" w:space="0" w:color="000000"/>
+            </w:tcBorders>
+          </w:tcPr>
+          <w:p>
+            <w:pPr/>
+            <w:r>
+              <w:rPr>
+                <w:rFonts w:ascii="Times New Roman" w:hAnsi="Times New Roman"/>
+                <w:sz w:val="26"/>
+              </w:rPr>
+              <w:t xml:space="preserve">Tạo Beacon, tạo JSON, mã hóa AES-128-CBC, quản lý sequence number</w:t>
             </w:r>
           </w:p>
         </w:tc>
       </w:tr>
       <w:tr>
         <w:trPr>
-          <w:jc w:val="center"/>
+          <w:trHeight w:val="400"/>
         </w:trPr>
         <w:tc>
           <w:tcPr>
-            <w:tcW w:w="4394" w:type="dxa"/>
-            <w:tcMar>
-              <w:top w:w="80" w:type="dxa"/>
-              <w:left w:w="80" w:type="dxa"/>
-              <w:bottom w:w="80" w:type="dxa"/>
-              <w:right w:w="80" w:type="dxa"/>
-            </w:tcMar>
-            <w:vAlign w:val="center"/>
-          </w:tcPr>
-          <w:p>
-            <w:pPr>
-              <w:spacing w:after="0" w:line="264" w:lineRule="auto"/>
-            </w:pPr>
-            <w:r>
-              <w:rPr>
-                <w:sz w:val="20"/>
-              </w:rPr>
-              <w:t>Khối mã hóa</w:t>
-            </w:r>
-          </w:p>
-        </w:tc>
-        <w:tc>
-          <w:tcPr>
-            <w:tcW w:w="4394" w:type="dxa"/>
-            <w:tcMar>
-              <w:top w:w="80" w:type="dxa"/>
-              <w:left w:w="80" w:type="dxa"/>
-              <w:bottom w:w="80" w:type="dxa"/>
-              <w:right w:w="80" w:type="dxa"/>
-            </w:tcMar>
-            <w:vAlign w:val="center"/>
-          </w:tcPr>
-          <w:p>
-            <w:pPr>
-              <w:spacing w:after="0" w:line="264" w:lineRule="auto"/>
-            </w:pPr>
-            <w:r>
-              <w:rPr>
-                <w:sz w:val="20"/>
-              </w:rPr>
-              <w:t>Thực hiện AES-128-CBC</w:t>
-            </w:r>
-          </w:p>
-        </w:tc>
-      </w:tr>
-      <w:tr>
-        <w:trPr>
-          <w:jc w:val="center"/>
-        </w:trPr>
-        <w:tc>
-          <w:tcPr>
-            <w:tcW w:w="4394" w:type="dxa"/>
-            <w:tcMar>
-              <w:top w:w="80" w:type="dxa"/>
-              <w:left w:w="80" w:type="dxa"/>
-              <w:bottom w:w="80" w:type="dxa"/>
-              <w:right w:w="80" w:type="dxa"/>
-            </w:tcMar>
-            <w:vAlign w:val="center"/>
-          </w:tcPr>
-          <w:p>
-            <w:pPr>
-              <w:spacing w:after="0" w:line="264" w:lineRule="auto"/>
-            </w:pPr>
-            <w:r>
-              <w:rPr>
-                <w:sz w:val="20"/>
-              </w:rPr>
-              <w:t>Khối payload</w:t>
-            </w:r>
-          </w:p>
-        </w:tc>
-        <w:tc>
-          <w:tcPr>
-            <w:tcW w:w="4394" w:type="dxa"/>
-            <w:tcMar>
-              <w:top w:w="80" w:type="dxa"/>
-              <w:left w:w="80" w:type="dxa"/>
-              <w:bottom w:w="80" w:type="dxa"/>
-              <w:right w:w="80" w:type="dxa"/>
-            </w:tcMar>
-            <w:vAlign w:val="center"/>
-          </w:tcPr>
-          <w:p>
-            <w:pPr>
-              <w:spacing w:after="0" w:line="264" w:lineRule="auto"/>
-            </w:pPr>
-            <w:r>
-              <w:rPr>
-                <w:sz w:val="20"/>
-              </w:rPr>
-              <w:t>Ghép IV, ciphertext và chuyển sang hex</w:t>
-            </w:r>
-          </w:p>
-        </w:tc>
-      </w:tr>
-      <w:tr>
-        <w:trPr>
-          <w:jc w:val="center"/>
-        </w:trPr>
-        <w:tc>
-          <w:tcPr>
-            <w:tcW w:w="4394" w:type="dxa"/>
-            <w:tcMar>
-              <w:top w:w="80" w:type="dxa"/>
-              <w:left w:w="80" w:type="dxa"/>
-              <w:bottom w:w="80" w:type="dxa"/>
-              <w:right w:w="80" w:type="dxa"/>
-            </w:tcMar>
-            <w:vAlign w:val="center"/>
-          </w:tcPr>
-          <w:p>
-            <w:pPr>
-              <w:spacing w:after="0" w:line="264" w:lineRule="auto"/>
-            </w:pPr>
-            <w:r>
-              <w:rPr>
-                <w:sz w:val="20"/>
-              </w:rPr>
-              <w:t>Khối truyền dữ liệu</w:t>
-            </w:r>
-          </w:p>
-        </w:tc>
-        <w:tc>
-          <w:tcPr>
-            <w:tcW w:w="4394" w:type="dxa"/>
-            <w:tcMar>
-              <w:top w:w="80" w:type="dxa"/>
-              <w:left w:w="80" w:type="dxa"/>
-              <w:bottom w:w="80" w:type="dxa"/>
-              <w:right w:w="80" w:type="dxa"/>
-            </w:tcMar>
-            <w:vAlign w:val="center"/>
-          </w:tcPr>
-          <w:p>
-            <w:pPr>
-              <w:spacing w:after="0" w:line="264" w:lineRule="auto"/>
-            </w:pPr>
-            <w:r>
-              <w:rPr>
-                <w:sz w:val="20"/>
-              </w:rPr>
-              <w:t>Gửi payload đến Gateway</w:t>
+            <w:tcW w:w="800" w:type="dxa"/>
+            <w:tcBorders>
+              <w:top w:val="single" w:sz="4" w:space="0" w:color="000000"/>
+              <w:left w:val="single" w:sz="4" w:space="0" w:color="000000"/>
+              <w:bottom w:val="single" w:sz="4" w:space="0" w:color="000000"/>
+              <w:right w:val="single" w:sz="4" w:space="0" w:color="000000"/>
+            </w:tcBorders>
+          </w:tcPr>
+          <w:p>
+            <w:pPr/>
+            <w:r>
+              <w:rPr>
+                <w:rFonts w:ascii="Times New Roman" w:hAnsi="Times New Roman"/>
+                <w:sz w:val="26"/>
+              </w:rPr>
+              <w:t xml:space="preserve">3</w:t>
+            </w:r>
+          </w:p>
+        </w:tc>
+        <w:tc>
+          <w:tcPr>
+            <w:tcW w:w="2500" w:type="dxa"/>
+            <w:tcBorders>
+              <w:top w:val="single" w:sz="4" w:space="0" w:color="000000"/>
+              <w:left w:val="single" w:sz="4" w:space="0" w:color="000000"/>
+              <w:bottom w:val="single" w:sz="4" w:space="0" w:color="000000"/>
+              <w:right w:val="single" w:sz="4" w:space="0" w:color="000000"/>
+            </w:tcBorders>
+          </w:tcPr>
+          <w:p>
+            <w:pPr/>
+            <w:r>
+              <w:rPr>
+                <w:rFonts w:ascii="Times New Roman" w:hAnsi="Times New Roman"/>
+                <w:sz w:val="26"/>
+              </w:rPr>
+              <w:t xml:space="preserve">Khối đầu ra</w:t>
+            </w:r>
+          </w:p>
+        </w:tc>
+        <w:tc>
+          <w:tcPr>
+            <w:tcW w:w="4200" w:type="dxa"/>
+            <w:tcBorders>
+              <w:top w:val="single" w:sz="4" w:space="0" w:color="000000"/>
+              <w:left w:val="single" w:sz="4" w:space="0" w:color="000000"/>
+              <w:bottom w:val="single" w:sz="4" w:space="0" w:color="000000"/>
+              <w:right w:val="single" w:sz="4" w:space="0" w:color="000000"/>
+            </w:tcBorders>
+          </w:tcPr>
+          <w:p>
+            <w:pPr/>
+            <w:r>
+              <w:rPr>
+                <w:rFonts w:ascii="Times New Roman" w:hAnsi="Times New Roman"/>
+                <w:sz w:val="26"/>
+              </w:rPr>
+              <w:t xml:space="preserve">Gửi Beacon, gửi payload mã hóa, ghi log trạng thái</w:t>
             </w:r>
           </w:p>
         </w:tc>
@@ -6177,154 +6390,15 @@
     </w:tbl>
     <w:p>
       <w:pPr>
-        <w:spacing w:after="60"/>
-      </w:pPr>
-    </w:p>
-    <w:p>
-      <w:pPr>
         <w:pStyle w:val="Heading3"/>
       </w:pPr>
-    </w:p>
-    <w:p>
-      <w:pPr>
-        <w:jc w:val="both"/>
-      </w:pPr>
-      <w:r>
-        <w:t>Dữ liệu đầu vào của node Xi gồm:</w:t>
-      </w:r>
-    </w:p>
-    <w:p>
-      <w:pPr>
-        <w:pStyle w:val="ListBullet"/>
-        <w:spacing w:after="40" w:line="300" w:lineRule="auto"/>
-        <w:ind w:left="397" w:hanging="170"/>
-      </w:pPr>
-      <w:r>
-        <w:t xml:space="preserve">Mã định danh node, ví dụ </w:t>
-      </w:r>
       <w:r>
         <w:rPr>
-          <w:rFonts w:ascii="Courier New" w:eastAsia="Courier New" w:hAnsi="Courier New"/>
-          <w:sz w:val="24"/>
+          <w:rFonts w:ascii="Times New Roman" w:hAnsi="Times New Roman"/>
+          <w:b w:val="0"/>
+          <w:sz w:val="26"/>
         </w:rPr>
-        <w:t>Xi_01</w:t>
-      </w:r>
-      <w:r>
-        <w:t>.</w:t>
-      </w:r>
-    </w:p>
-    <w:p>
-      <w:pPr>
-        <w:pStyle w:val="ListBullet"/>
-        <w:spacing w:after="40" w:line="300" w:lineRule="auto"/>
-        <w:ind w:left="397" w:hanging="170"/>
-      </w:pPr>
-      <w:r>
-        <w:t xml:space="preserve">Mã Gateway dự kiến, ví dụ </w:t>
-      </w:r>
-      <w:r>
-        <w:rPr>
-          <w:rFonts w:ascii="Courier New" w:eastAsia="Courier New" w:hAnsi="Courier New"/>
-          <w:sz w:val="24"/>
-        </w:rPr>
-        <w:t>Y_01</w:t>
-      </w:r>
-      <w:r>
-        <w:t>.</w:t>
-      </w:r>
-    </w:p>
-    <w:p>
-      <w:pPr>
-        <w:pStyle w:val="ListBullet"/>
-        <w:spacing w:after="40" w:line="300" w:lineRule="auto"/>
-        <w:ind w:left="397" w:hanging="170"/>
-      </w:pPr>
-      <w:r>
-        <w:t>Khóa AES 16 byte.</w:t>
-      </w:r>
-    </w:p>
-    <w:p>
-      <w:pPr>
-        <w:pStyle w:val="ListBullet"/>
-        <w:spacing w:after="40" w:line="300" w:lineRule="auto"/>
-        <w:ind w:left="397" w:hanging="170"/>
-      </w:pPr>
-      <w:r>
-        <w:t>Dữ liệu cảm biến.</w:t>
-      </w:r>
-    </w:p>
-    <w:p>
-      <w:pPr>
-        <w:pStyle w:val="ListBullet"/>
-        <w:spacing w:after="40" w:line="300" w:lineRule="auto"/>
-        <w:ind w:left="397" w:hanging="170"/>
-      </w:pPr>
-      <w:r>
-        <w:t>Dữ liệu GPS.</w:t>
-      </w:r>
-    </w:p>
-    <w:p>
-      <w:pPr>
-        <w:pStyle w:val="ListBullet"/>
-        <w:spacing w:after="40" w:line="300" w:lineRule="auto"/>
-        <w:ind w:left="397" w:hanging="170"/>
-      </w:pPr>
-      <w:r>
-        <w:t>ACK từ Gateway.</w:t>
-      </w:r>
-    </w:p>
-    <w:p>
-      <w:pPr>
-        <w:pStyle w:val="ListBullet"/>
-        <w:spacing w:after="40" w:line="300" w:lineRule="auto"/>
-        <w:ind w:left="397" w:hanging="170"/>
-      </w:pPr>
-      <w:r>
-        <w:t>Giá trị sequence number hiện tại.</w:t>
-      </w:r>
-    </w:p>
-    <w:p>
-      <w:pPr>
-        <w:pStyle w:val="Heading3"/>
-      </w:pPr>
-    </w:p>
-    <w:p>
-      <w:pPr>
-        <w:jc w:val="both"/>
-      </w:pPr>
-      <w:r>
-        <w:t>Dữ liệu đầu ra của node Xi gồm:</w:t>
-      </w:r>
-    </w:p>
-    <w:p>
-      <w:pPr>
-        <w:pStyle w:val="ListBullet"/>
-        <w:spacing w:after="40" w:line="300" w:lineRule="auto"/>
-        <w:ind w:left="397" w:hanging="170"/>
-      </w:pPr>
-      <w:r>
-        <w:t>Gói Beacon.</w:t>
-      </w:r>
-    </w:p>
-    <w:p>
-      <w:pPr>
-        <w:pStyle w:val="ListBullet"/>
-        <w:spacing w:after="40" w:line="300" w:lineRule="auto"/>
-        <w:ind w:left="397" w:hanging="170"/>
-      </w:pPr>
-      <w:r>
-        <w:t>Payload mã hóa.</w:t>
-      </w:r>
-    </w:p>
-    <w:p>
-      <w:pPr>
-        <w:pStyle w:val="ListBullet"/>
-        <w:spacing w:after="40" w:line="300" w:lineRule="auto"/>
-        <w:ind w:left="397" w:hanging="170"/>
-      </w:pPr>
-      <w:r>
-        <w:lastRenderedPageBreak/>
-        <w:t>Log trạng thái hoạt động.</w:t>
+        <w:t>3.3.3. Các gói tin của Node Xi</w:t>
       </w:r>
     </w:p>
     <w:p>
@@ -6365,6 +6439,19 @@
       <w:pPr>
         <w:pStyle w:val="Heading3"/>
       </w:pPr>
+    </w:p>
+    <w:p>
+      <w:pPr>
+        <w:pStyle w:val="Heading3"/>
+      </w:pPr>
+      <w:r>
+        <w:rPr>
+          <w:rFonts w:ascii="Times New Roman" w:hAnsi="Times New Roman"/>
+          <w:b w:val="0"/>
+          <w:sz w:val="26"/>
+        </w:rPr>
+        <w:t>3.3.4. Luồng hoạt động chi tiết của Node Xi</w:t>
+      </w:r>
     </w:p>
     <w:p>
       <w:pPr>
@@ -6755,7 +6842,12 @@
         <w:jc w:val="both"/>
       </w:pPr>
       <w:r>
-        <w:t>Bảng mô tả các trường:</w:t>
+        <w:rPr>
+          <w:rFonts w:ascii="Times New Roman" w:hAnsi="Times New Roman"/>
+          <w:b/>
+          <w:sz w:val="26"/>
+        </w:rPr>
+        <w:t>Bảng 3.3. Mô tả các trường dữ liệu JSON</w:t>
       </w:r>
     </w:p>
     <w:tbl>
@@ -8388,8 +8480,14 @@
       <w:pPr>
         <w:pStyle w:val="Heading2"/>
       </w:pPr>
-      <w:r>
-        <w:t>3.5. Thiết kế Gateway Y</w:t>
+      <w:r/>
+      <w:r>
+        <w:rPr>
+          <w:rFonts w:ascii="Times New Roman" w:hAnsi="Times New Roman"/>
+          <w:b/>
+          <w:sz w:val="26"/>
+        </w:rPr>
+        <w:t>3.4. Thiết kế IoT Gateway</w:t>
       </w:r>
     </w:p>
     <w:p>
@@ -8399,6 +8497,19 @@
     </w:p>
     <w:p>
       <w:pPr>
+        <w:pStyle w:val="Heading3"/>
+      </w:pPr>
+      <w:r>
+        <w:rPr>
+          <w:rFonts w:ascii="Times New Roman" w:hAnsi="Times New Roman"/>
+          <w:b w:val="0"/>
+          <w:sz w:val="26"/>
+        </w:rPr>
+        <w:t>3.4.1. Lựa chọn thiết bị cho IoT Gateway</w:t>
+      </w:r>
+    </w:p>
+    <w:p>
+      <w:pPr>
         <w:jc w:val="both"/>
       </w:pPr>
       <w:r>
@@ -8420,10 +8531,28 @@
     </w:p>
     <w:p>
       <w:pPr>
+        <w:pStyle w:val="Heading3"/>
+      </w:pPr>
+      <w:r>
+        <w:rPr>
+          <w:rFonts w:ascii="Times New Roman" w:hAnsi="Times New Roman"/>
+          <w:b w:val="0"/>
+          <w:sz w:val="26"/>
+        </w:rPr>
+        <w:t>3.4.2. Các thành phần chức năng trong IoT Gateway</w:t>
+      </w:r>
+    </w:p>
+    <w:p>
+      <w:pPr>
         <w:jc w:val="both"/>
       </w:pPr>
       <w:r>
-        <w:t>Gateway Y gồm các khối chức năng sau:</w:t>
+        <w:rPr>
+          <w:rFonts w:ascii="Times New Roman" w:hAnsi="Times New Roman"/>
+          <w:sz w:val="26"/>
+          <w:b/>
+        </w:rPr>
+        <w:t xml:space="preserve">Bảng 3.4. Các khối chức năng trong IoT Gateway</w:t>
       </w:r>
     </w:p>
     <w:tbl>
@@ -8915,6 +9044,19 @@
     </w:p>
     <w:p>
       <w:pPr>
+        <w:pStyle w:val="Heading3"/>
+      </w:pPr>
+      <w:r>
+        <w:rPr>
+          <w:rFonts w:ascii="Times New Roman" w:hAnsi="Times New Roman"/>
+          <w:b w:val="0"/>
+          <w:sz w:val="26"/>
+        </w:rPr>
+        <w:t>3.4.3. Các gói tin của IoT Gateway</w:t>
+      </w:r>
+    </w:p>
+    <w:p>
+      <w:pPr>
         <w:jc w:val="both"/>
       </w:pPr>
       <w:r>
@@ -9201,6 +9343,19 @@
       <w:pPr>
         <w:pStyle w:val="Heading3"/>
       </w:pPr>
+    </w:p>
+    <w:p>
+      <w:pPr>
+        <w:pStyle w:val="Heading3"/>
+      </w:pPr>
+      <w:r>
+        <w:rPr>
+          <w:rFonts w:ascii="Times New Roman" w:hAnsi="Times New Roman"/>
+          <w:b w:val="0"/>
+          <w:sz w:val="26"/>
+        </w:rPr>
+        <w:t>3.4.4. Luồng hoạt động chi tiết của IoT Gateway</w:t>
+      </w:r>
     </w:p>
     <w:p>
       <w:pPr>
@@ -9344,365 +9499,6 @@
         <w:t>Gateway không phân tích nội dung bên trong payload. Gateway chỉ kiểm tra có nhận được payload hay không, sau đó chuyển tiếp lên Server.</w:t>
       </w:r>
     </w:p>
-    <w:p>
-      <w:pPr>
-        <w:pStyle w:val="Heading2"/>
-      </w:pPr>
-      <w:r>
-        <w:t>3.6. Thiết kế quy trình mã hóa AES-128-CBC</w:t>
-      </w:r>
-    </w:p>
-    <w:p>
-      <w:pPr>
-        <w:pStyle w:val="Heading3"/>
-      </w:pPr>
-    </w:p>
-    <w:p>
-      <w:pPr>
-        <w:jc w:val="both"/>
-      </w:pPr>
-      <w:r>
-        <w:t>Dữ liệu truyền qua môi trường không dây có nguy cơ bị nghe lén. Nếu truyền JSON trực tiếp, người ngoài có thể đọc được nội dung như nhiệt độ, độ ẩm, vị trí GPS hoặc sequence number. Vì vậy, dữ liệu cần được mã hóa trước khi gửi.</w:t>
-      </w:r>
-    </w:p>
-    <w:p>
-      <w:pPr>
-        <w:jc w:val="both"/>
-      </w:pPr>
-      <w:r>
-        <w:t>AES là thuật toán mã hóa đối xứng được sử dụng rộng rãi. AES-128 sử dụng khóa 128 bit, tương ứng 16 byte. Chế độ CBC sử dụng IV để làm cho quá trình mã hóa an toàn hơn so với việc mã hóa từng khối độc lập.</w:t>
-      </w:r>
-    </w:p>
-    <w:p>
-      <w:pPr>
-        <w:jc w:val="both"/>
-      </w:pPr>
-      <w:r>
-        <w:t>Trong hệ thống, AES-128-CBC được lựa chọn vì:</w:t>
-      </w:r>
-    </w:p>
-    <w:p>
-      <w:pPr>
-        <w:pStyle w:val="ListBullet"/>
-        <w:spacing w:after="40" w:line="300" w:lineRule="auto"/>
-        <w:ind w:left="397" w:hanging="170"/>
-      </w:pPr>
-      <w:r>
-        <w:t>Có độ bảo mật phù hợp với mô hình thử nghiệm.</w:t>
-      </w:r>
-    </w:p>
-    <w:p>
-      <w:pPr>
-        <w:pStyle w:val="ListBullet"/>
-        <w:spacing w:after="40" w:line="300" w:lineRule="auto"/>
-        <w:ind w:left="397" w:hanging="170"/>
-      </w:pPr>
-      <w:r>
-        <w:t>Có thể triển khai trên ESP32.</w:t>
-      </w:r>
-    </w:p>
-    <w:p>
-      <w:pPr>
-        <w:pStyle w:val="ListBullet"/>
-        <w:spacing w:after="40" w:line="300" w:lineRule="auto"/>
-        <w:ind w:left="397" w:hanging="170"/>
-      </w:pPr>
-      <w:r>
-        <w:t>Phù hợp với dữ liệu dạng JSON có kích thước nhỏ.</w:t>
-      </w:r>
-    </w:p>
-    <w:p>
-      <w:pPr>
-        <w:pStyle w:val="ListBullet"/>
-        <w:spacing w:after="40" w:line="300" w:lineRule="auto"/>
-        <w:ind w:left="397" w:hanging="170"/>
-      </w:pPr>
-      <w:r>
-        <w:t>Server có thể giải mã dễ dàng bằng cùng khóa bí mật.</w:t>
-      </w:r>
-    </w:p>
-    <w:p>
-      <w:pPr>
-        <w:pStyle w:val="ListBullet"/>
-        <w:spacing w:after="40" w:line="300" w:lineRule="auto"/>
-        <w:ind w:left="397" w:hanging="170"/>
-      </w:pPr>
-      <w:r>
-        <w:t>Có thể kết hợp với IV để tránh cùng plaintext tạo cùng ciphertext.</w:t>
-      </w:r>
-    </w:p>
-    <w:p>
-      <w:pPr>
-        <w:pStyle w:val="Heading3"/>
-      </w:pPr>
-    </w:p>
-    <w:p>
-      <w:pPr>
-        <w:jc w:val="both"/>
-      </w:pPr>
-      <w:r>
-        <w:t>Dữ liệu đầu vào là chuỗi JSON chứa dữ liệu cảm biến, GPS, Gateway và sequence number.</w:t>
-      </w:r>
-    </w:p>
-    <w:p>
-      <w:pPr>
-        <w:jc w:val="both"/>
-      </w:pPr>
-      <w:r>
-        <w:t>Ví dụ:</w:t>
-      </w:r>
-    </w:p>
-    <w:p>
-      <w:pPr>
-        <w:pStyle w:val="CodeBlock"/>
-        <w:keepLines/>
-      </w:pPr>
-      <w:r>
-        <w:t>{ "id": "Xi_01", "t": 28.5, "h": 65.2, "gw": "Y_01", "seq": 1001</w:t>
-        <w:br/>
-        <w:t>}</w:t>
-      </w:r>
-      <w:r/>
-      <w:r/>
-      <w:r/>
-      <w:r/>
-      <w:r/>
-      <w:r/>
-    </w:p>
-    <w:p>
-      <w:pPr>
-        <w:jc w:val="both"/>
-      </w:pPr>
-      <w:r>
-        <w:t>Chuỗi JSON này được chuyển thành mảng byte trước khi mã hóa.</w:t>
-      </w:r>
-    </w:p>
-    <w:p>
-      <w:pPr>
-        <w:pStyle w:val="Heading3"/>
-      </w:pPr>
-    </w:p>
-    <w:p>
-      <w:pPr>
-        <w:jc w:val="both"/>
-      </w:pPr>
-      <w:r>
-        <w:t>AES-128 sử dụng khóa 16 byte.</w:t>
-      </w:r>
-    </w:p>
-    <w:p>
-      <w:pPr>
-        <w:jc w:val="both"/>
-      </w:pPr>
-      <w:r>
-        <w:t>Ở mức thiết kế:</w:t>
-      </w:r>
-    </w:p>
-    <w:p>
-      <w:pPr>
-        <w:pStyle w:val="CodeBlock"/>
-        <w:keepLines/>
-      </w:pPr>
-      <w:r>
-        <w:t>Key = 16 byte bí mật được cấu hình trước ở node Xi và Server</w:t>
-      </w:r>
-    </w:p>
-    <w:p>
-      <w:pPr>
-        <w:jc w:val="both"/>
-      </w:pPr>
-      <w:r>
-        <w:t>Khóa chỉ tồn tại ở node Xi và Server. Gateway không cần khóa vì Gateway không giải mã dữ liệu.</w:t>
-      </w:r>
-    </w:p>
-    <w:p>
-      <w:pPr>
-        <w:jc w:val="both"/>
-      </w:pPr>
-      <w:r>
-        <w:t>Trong báo cáo, không nên ghi khóa thật nếu hệ thống có sử dụng khóa cụ thể trong mã nguồn. Có thể mô tả khóa ở mức nguyên lý để tránh lộ thông tin bảo mật.</w:t>
-      </w:r>
-    </w:p>
-    <w:p>
-      <w:pPr>
-        <w:pStyle w:val="Heading3"/>
-      </w:pPr>
-    </w:p>
-    <w:p>
-      <w:pPr>
-        <w:jc w:val="both"/>
-      </w:pPr>
-      <w:r>
-        <w:t>AES-CBC xử lý dữ liệu theo từng khối 16 byte. Tuy nhiên, chuỗi JSON có thể có độ dài bất kỳ. Vì vậy, trước khi mã hóa cần thêm padding để độ dài plaintext trở thành bội số của 16.</w:t>
-      </w:r>
-    </w:p>
-    <w:p>
-      <w:pPr>
-        <w:jc w:val="both"/>
-      </w:pPr>
-      <w:r>
-        <w:t>Công thức:</w:t>
-      </w:r>
-    </w:p>
-    <w:p>
-      <w:pPr>
-        <w:pStyle w:val="CodeBlock"/>
-        <w:keepLines/>
-      </w:pPr>
-      <w:r>
-        <w:t>padding_length = 16 - (plaintext_length mod 16)</w:t>
-      </w:r>
-    </w:p>
-    <w:p>
-      <w:pPr>
-        <w:jc w:val="both"/>
-      </w:pPr>
-      <w:r>
-        <w:t>Ví dụ:</w:t>
-      </w:r>
-    </w:p>
-    <w:p>
-      <w:pPr>
-        <w:pStyle w:val="CodeBlock"/>
-        <w:keepLines/>
-      </w:pPr>
-      <w:r>
-        <w:t>plaintext_length = 45 byte</w:t>
-      </w:r>
-      <w:r>
-        <w:br/>
-        <w:t>45 mod 16 = 13</w:t>
-      </w:r>
-      <w:r>
-        <w:br/>
-        <w:t>padding_length = 16 - 13 = 3</w:t>
-      </w:r>
-    </w:p>
-    <w:p>
-      <w:pPr>
-        <w:jc w:val="both"/>
-      </w:pPr>
-      <w:r>
-        <w:t>Khi đó hệ thống thêm 3 byte padding.</w:t>
-      </w:r>
-    </w:p>
-    <w:p>
-      <w:pPr>
-        <w:jc w:val="both"/>
-      </w:pPr>
-      <w:r>
-        <w:t>Sau khi giải mã, Server dựa vào giá trị padding để loại bỏ phần dữ liệu thêm vào và khôi phục lại JSON ban đầu.</w:t>
-      </w:r>
-    </w:p>
-    <w:p>
-      <w:pPr>
-        <w:pStyle w:val="Heading3"/>
-      </w:pPr>
-    </w:p>
-    <w:p>
-      <w:pPr>
-        <w:jc w:val="both"/>
-      </w:pPr>
-      <w:r>
-        <w:t>IV là viết tắt của Initialization Vector. IV có độ dài 16 byte, bằng kích thước khối AES.</w:t>
-      </w:r>
-    </w:p>
-    <w:p>
-      <w:pPr>
-        <w:jc w:val="both"/>
-      </w:pPr>
-      <w:r>
-        <w:t>Trong hệ thống:</w:t>
-      </w:r>
-    </w:p>
-    <w:p>
-      <w:pPr>
-        <w:pStyle w:val="ListBullet"/>
-        <w:spacing w:after="40" w:line="300" w:lineRule="auto"/>
-        <w:ind w:left="397" w:hanging="170"/>
-      </w:pPr>
-      <w:r>
-        <w:t>Mỗi lần mã hóa tạo một IV mới.</w:t>
-      </w:r>
-    </w:p>
-    <w:p>
-      <w:pPr>
-        <w:pStyle w:val="ListBullet"/>
-        <w:spacing w:after="40" w:line="300" w:lineRule="auto"/>
-        <w:ind w:left="397" w:hanging="170"/>
-      </w:pPr>
-      <w:r>
-        <w:t>IV không cần giữ bí mật.</w:t>
-      </w:r>
-    </w:p>
-    <w:p>
-      <w:pPr>
-        <w:pStyle w:val="ListBullet"/>
-        <w:spacing w:after="40" w:line="300" w:lineRule="auto"/>
-        <w:ind w:left="397" w:hanging="170"/>
-      </w:pPr>
-      <w:r>
-        <w:t>IV được ghép vào đầu ciphertext.</w:t>
-      </w:r>
-    </w:p>
-    <w:p>
-      <w:pPr>
-        <w:pStyle w:val="ListBullet"/>
-        <w:spacing w:after="40" w:line="300" w:lineRule="auto"/>
-        <w:ind w:left="397" w:hanging="170"/>
-      </w:pPr>
-      <w:r>
-        <w:t>Server tách 16 byte đầu tiên để lấy IV.</w:t>
-      </w:r>
-    </w:p>
-    <w:p>
-      <w:pPr>
-        <w:pStyle w:val="ListBullet"/>
-        <w:spacing w:after="40" w:line="300" w:lineRule="auto"/>
-        <w:ind w:left="397" w:hanging="170"/>
-      </w:pPr>
-      <w:r>
-        <w:t>Phần còn lại là ciphertext.</w:t>
-      </w:r>
-    </w:p>
-    <w:p>
-      <w:pPr>
-        <w:jc w:val="both"/>
-      </w:pPr>
-      <w:r>
-        <w:t>Việc sử dụng IV giúp cùng một dữ liệu JSON khi mã hóa ở hai lần khác nhau có thể tạo ra ciphertext khác nhau.</w:t>
-      </w:r>
-    </w:p>
-    <w:p>
-      <w:pPr>
-        <w:pStyle w:val="Heading3"/>
-      </w:pPr>
-    </w:p>
-    <w:p>
-      <w:pPr>
-        <w:jc w:val="both"/>
-      </w:pPr>
-      <w:r>
-        <w:t>Sau khi mã hóa, payload có cấu trúc:</w:t>
-      </w:r>
-    </w:p>
-    <w:p>
-      <w:pPr>
-        <w:pStyle w:val="CodeBlock"/>
-        <w:keepLines/>
-      </w:pPr>
-      <w:r>
-        <w:t>Payload byte = IV || Ciphertext</w:t>
-      </w:r>
-    </w:p>
-    <w:p>
-      <w:pPr>
-        <w:jc w:val="both"/>
-      </w:pPr>
-      <w:r>
-        <w:t>Trong đó:</w:t>
-      </w:r>
-    </w:p>
     <w:tbl>
       <w:tblPr>
         <w:tblStyle w:val="TableGrid"/>
@@ -9947,161 +9743,52 @@
     </w:tbl>
     <w:p>
       <w:pPr>
-        <w:spacing w:after="60"/>
-      </w:pPr>
-    </w:p>
-    <w:p>
-      <w:pPr>
-        <w:jc w:val="both"/>
-      </w:pPr>
-      <w:r>
-        <w:lastRenderedPageBreak/>
-        <w:t>Sau đó payload byte được chuyển thành chuỗi hex:</w:t>
-      </w:r>
-    </w:p>
-    <w:p>
-      <w:pPr>
-        <w:pStyle w:val="CodeBlock"/>
-        <w:keepLines/>
-      </w:pPr>
-      <w:r>
-        <w:t>Payload hex = HEX(IV || Ciphertext)</w:t>
-      </w:r>
-    </w:p>
-    <w:p>
-      <w:pPr>
-        <w:jc w:val="both"/>
-      </w:pPr>
-      <w:r>
-        <w:t>Ví dụ minh họa:</w:t>
-      </w:r>
-    </w:p>
-    <w:p>
-      <w:pPr>
-        <w:pStyle w:val="CodeBlock"/>
-        <w:keepLines/>
-      </w:pPr>
-      <w:r>
-        <w:t>IV: 16 byte đầu</w:t>
-        <w:br/>
-        <w:t>Ciphertext: các byte còn lại</w:t>
-        <w:br/>
-        <w:t>Payload: IV + Ciphertext</w:t>
-      </w:r>
-      <w:r/>
-      <w:r/>
-    </w:p>
-    <w:p>
-      <w:pPr>
-        <w:pStyle w:val="Heading3"/>
-      </w:pPr>
-    </w:p>
-    <w:p>
-      <w:pPr>
-        <w:pStyle w:val="CodeBlock"/>
-        <w:keepLines/>
-      </w:pPr>
-      <w:r>
-        <w:t>Dữ liệu cảm biến và GPS ↓</w:t>
-        <w:br/>
-        <w:t>Tạo JSON ↓</w:t>
-        <w:br/>
-        <w:t>Thêm id, gw và seq ↓</w:t>
-        <w:br/>
-        <w:t>Chuyển JSON thành byte ↓</w:t>
-        <w:br/>
-        <w:t>Tính padding ↓</w:t>
-        <w:br/>
-        <w:t>Thêm padding ↓</w:t>
-        <w:br/>
-        <w:t>Tạo IV 16 byte ↓</w:t>
-        <w:br/>
-        <w:t>Mã hóa AES-128-CBC ↓</w:t>
-        <w:br/>
-        <w:t>Ghép IV + ciphertext ↓</w:t>
-        <w:br/>
-        <w:t>Chuyển sang chuỗi hex ↓</w:t>
-        <w:br/>
-        <w:t>Gửi payload đến Gateway</w:t>
-      </w:r>
-      <w:r/>
-      <w:r/>
-      <w:r/>
-      <w:r/>
-      <w:r/>
-      <w:r/>
-      <w:r/>
-      <w:r/>
-      <w:r/>
-      <w:r/>
-      <w:r/>
-      <w:r/>
-      <w:r/>
-      <w:r/>
-      <w:r/>
-      <w:r/>
-      <w:r/>
-      <w:r/>
-      <w:r/>
-      <w:r/>
-    </w:p>
-    <w:p>
-      <w:pPr>
-        <w:pStyle w:val="Heading3"/>
-      </w:pPr>
-    </w:p>
-    <w:p>
-      <w:pPr>
-        <w:pStyle w:val="CodeBlock"/>
-        <w:keepLines/>
-      </w:pPr>
-      <w:r>
-        <w:t>Nhận payload hex ↓</w:t>
-        <w:br/>
-        <w:t>Chuyển hex thành byte ↓</w:t>
-        <w:br/>
-        <w:t>Tách 16 byte đầu làm IV ↓</w:t>
-        <w:br/>
-        <w:t>Lấy phần còn lại làm ciphertext ↓</w:t>
-        <w:br/>
-        <w:t>Giải mã AES-128-CBC ↓</w:t>
-        <w:br/>
-        <w:t>Loại bỏ padding ↓</w:t>
-        <w:br/>
-        <w:t>Khôi phục JSON plaintext ↓</w:t>
-        <w:br/>
-        <w:t>Kiểm tra dữ liệu</w:t>
-      </w:r>
-      <w:r/>
-      <w:r/>
-      <w:r/>
-      <w:r/>
-      <w:r/>
-      <w:r/>
-      <w:r/>
-      <w:r/>
-      <w:r/>
-      <w:r/>
-      <w:r/>
-      <w:r/>
-      <w:r/>
-      <w:r/>
-    </w:p>
-    <w:p>
-      <w:pPr>
         <w:pStyle w:val="Heading2"/>
       </w:pPr>
       <w:r>
         <w:rPr>
           <w:b/>
         </w:rPr>
-        <w:t>3.7. Thiết kế Server và cơ chế chống tấn công phát lại</w:t>
+      </w:r>
+      <w:r>
+        <w:rPr>
+          <w:rFonts w:ascii="Times New Roman" w:hAnsi="Times New Roman"/>
+          <w:b/>
+          <w:sz w:val="26"/>
+        </w:rPr>
+        <w:t>3.5. Thiết kế máy chủ trung tâm giám sát</w:t>
       </w:r>
     </w:p>
     <w:p>
       <w:pPr>
         <w:pStyle w:val="Heading3"/>
       </w:pPr>
+    </w:p>
+    <w:p>
+      <w:pPr>
+        <w:pStyle w:val="Heading3"/>
+      </w:pPr>
+      <w:r>
+        <w:rPr>
+          <w:rFonts w:ascii="Times New Roman" w:hAnsi="Times New Roman"/>
+          <w:b w:val="0"/>
+          <w:sz w:val="26"/>
+        </w:rPr>
+        <w:t>3.5.1. Lựa chọn cấu hình máy chủ trung tâm</w:t>
+      </w:r>
+    </w:p>
+    <w:p>
+      <w:pPr>
+        <w:pStyle w:val="Heading3"/>
+      </w:pPr>
+      <w:r>
+        <w:rPr>
+          <w:rFonts w:ascii="Times New Roman" w:hAnsi="Times New Roman"/>
+          <w:b w:val="0"/>
+          <w:sz w:val="26"/>
+        </w:rPr>
+        <w:t>3.5.2. Flask Server</w:t>
+      </w:r>
     </w:p>
     <w:p>
       <w:pPr>
@@ -10448,6 +10135,17 @@
         <w:pStyle w:val="Heading3"/>
       </w:pPr>
     </w:p>
+    <w:p>
+      <w:pPr/>
+      <w:r>
+        <w:rPr>
+          <w:rFonts w:ascii="Times New Roman" w:hAnsi="Times New Roman"/>
+          <w:sz w:val="26"/>
+          <w:b/>
+        </w:rPr>
+        <w:t xml:space="preserve">Bảng 3.5. Các trường hợp lỗi khi xử lý request tại Server</w:t>
+      </w:r>
+    </w:p>
     <w:tbl>
       <w:tblPr>
         <w:tblStyle w:val="TableGrid"/>
@@ -12198,13 +11896,20 @@
     </w:p>
     <w:p>
       <w:pPr>
-        <w:pStyle w:val="Heading2"/>
+        <w:pStyle w:val="Heading3"/>
       </w:pPr>
       <w:r>
         <w:rPr>
           <w:b/>
         </w:rPr>
-        <w:t>3.8. Thiết kế cơ sở dữ liệu và Dashboard</w:t>
+      </w:r>
+      <w:r>
+        <w:rPr>
+          <w:rFonts w:ascii="Times New Roman" w:hAnsi="Times New Roman"/>
+          <w:b/>
+          <w:sz w:val="26"/>
+        </w:rPr>
+        <w:t>3.5.3. Cơ sở dữ liệu trung tâm</w:t>
       </w:r>
     </w:p>
     <w:p>
@@ -12308,17 +12013,12 @@
         <w:jc w:val="both"/>
       </w:pPr>
       <w:r>
-        <w:t xml:space="preserve">Bảng </w:t>
-      </w:r>
-      <w:r>
         <w:rPr>
-          <w:rFonts w:ascii="Courier New" w:eastAsia="Courier New" w:hAnsi="Courier New"/>
-          <w:sz w:val="24"/>
+          <w:rFonts w:ascii="Times New Roman" w:hAnsi="Times New Roman"/>
+          <w:b/>
+          <w:sz w:val="26"/>
         </w:rPr>
-        <w:t>devices</w:t>
-      </w:r>
-      <w:r>
-        <w:t xml:space="preserve"> lưu thông tin thiết bị.</w:t>
+        <w:t>Bảng 3.6. Bảng devices lưu thông tin thiết bị</w:t>
       </w:r>
     </w:p>
     <w:tbl>
@@ -13317,17 +13017,12 @@
         <w:jc w:val="both"/>
       </w:pPr>
       <w:r>
-        <w:t xml:space="preserve">Bảng </w:t>
-      </w:r>
-      <w:r>
         <w:rPr>
-          <w:rFonts w:ascii="Courier New" w:eastAsia="Courier New" w:hAnsi="Courier New"/>
-          <w:sz w:val="24"/>
+          <w:rFonts w:ascii="Times New Roman" w:hAnsi="Times New Roman"/>
+          <w:b/>
+          <w:sz w:val="26"/>
         </w:rPr>
-        <w:t>telemetry</w:t>
-      </w:r>
-      <w:r>
-        <w:t xml:space="preserve"> lưu dữ liệu cảm biến hợp lệ sau khi giải mã.</w:t>
+        <w:t>Bảng 3.7. Bảng telemetry lưu dữ liệu cảm biến</w:t>
       </w:r>
     </w:p>
     <w:tbl>
@@ -15164,17 +14859,12 @@
         <w:jc w:val="both"/>
       </w:pPr>
       <w:r>
-        <w:t xml:space="preserve">Bảng </w:t>
-      </w:r>
-      <w:r>
         <w:rPr>
-          <w:rFonts w:ascii="Courier New" w:eastAsia="Courier New" w:hAnsi="Courier New"/>
-          <w:sz w:val="24"/>
+          <w:rFonts w:ascii="Times New Roman" w:hAnsi="Times New Roman"/>
+          <w:b/>
+          <w:sz w:val="26"/>
         </w:rPr>
-        <w:t>benchmark</w:t>
-      </w:r>
-      <w:r>
-        <w:t xml:space="preserve"> lưu thông tin thời gian xử lý của Server.</w:t>
+        <w:t>Bảng 3.8. Bảng benchmark lưu thông tin thời gian xử lý của Server</w:t>
       </w:r>
     </w:p>
     <w:tbl>
@@ -16514,48 +16204,35 @@
         <w:jc w:val="both"/>
       </w:pPr>
       <w:r>
-        <w:t xml:space="preserve">Một thiết bị có thể có nhiều bản ghi telemetry và nhiều bản ghi benchmark. Bảng </w:t>
-      </w:r>
-      <w:r>
         <w:rPr>
-          <w:rFonts w:ascii="Courier New" w:eastAsia="Courier New" w:hAnsi="Courier New"/>
-          <w:sz w:val="24"/>
+          <w:rFonts w:ascii="Times New Roman" w:hAnsi="Times New Roman"/>
+          <w:sz w:val="26"/>
         </w:rPr>
-        <w:t>devices</w:t>
-      </w:r>
-      <w:r>
-        <w:t xml:space="preserve"> giúp quản lý thiết bị và sequence number. Bảng </w:t>
-      </w:r>
+        <w:t>Một thiết bị có thể có nhiều bản ghi telemetry và nhiều bản ghi benchmark. Bảng 3.6 giúp quản lý thiết bị và sequence number. Bảng 3.7 lưu dữ liệu cảm biến. Bảng 3.8 lưu dữ liệu đánh giá hiệu năng.</w:t>
+      </w:r>
+    </w:p>
+    <w:p>
+      <w:pPr>
+        <w:pStyle w:val="Heading2"/>
+      </w:pPr>
+    </w:p>
+    <w:p>
+      <w:pPr>
+        <w:pStyle w:val="Heading3"/>
+      </w:pPr>
+    </w:p>
+    <w:p>
+      <w:pPr>
+        <w:pStyle w:val="Heading3"/>
+      </w:pPr>
       <w:r>
         <w:rPr>
-          <w:rFonts w:ascii="Courier New" w:eastAsia="Courier New" w:hAnsi="Courier New"/>
-          <w:sz w:val="24"/>
+          <w:rFonts w:ascii="Times New Roman" w:hAnsi="Times New Roman"/>
+          <w:b w:val="0"/>
+          <w:sz w:val="26"/>
         </w:rPr>
-        <w:t>telemetry</w:t>
-      </w:r>
-      <w:r>
-        <w:t xml:space="preserve"> lưu dữ liệu cảm biến. Bảng </w:t>
-      </w:r>
-      <w:r>
-        <w:rPr>
-          <w:rFonts w:ascii="Courier New" w:eastAsia="Courier New" w:hAnsi="Courier New"/>
-          <w:sz w:val="24"/>
-        </w:rPr>
-        <w:t>benchmark</w:t>
-      </w:r>
-      <w:r>
-        <w:t xml:space="preserve"> lưu dữ liệu đánh giá hiệu năng.</w:t>
-      </w:r>
-    </w:p>
-    <w:p>
-      <w:pPr>
-        <w:pStyle w:val="Heading2"/>
-      </w:pPr>
-    </w:p>
-    <w:p>
-      <w:pPr>
-        <w:pStyle w:val="Heading3"/>
-      </w:pPr>
+        <w:t>3.5.4. Thiết kế Dashboard</w:t>
+      </w:r>
     </w:p>
     <w:p>
       <w:pPr>
@@ -17019,11 +16696,577 @@
       <w:pPr>
         <w:pStyle w:val="Heading2"/>
       </w:pPr>
+      <w:r/>
+      <w:r>
+        <w:rPr>
+          <w:rFonts w:ascii="Times New Roman" w:hAnsi="Times New Roman"/>
+          <w:b/>
+          <w:sz w:val="26"/>
+        </w:rPr>
+        <w:t>3.6. Cơ chế mã hóa và giải mã bản tin</w:t>
+      </w:r>
+    </w:p>
+    <w:p>
+      <w:pPr>
+        <w:pStyle w:val="Heading3"/>
+      </w:pPr>
+    </w:p>
+    <w:p>
+      <w:pPr>
+        <w:pStyle w:val="Heading3"/>
+      </w:pPr>
+      <w:r>
+        <w:rPr>
+          <w:rFonts w:ascii="Times New Roman" w:hAnsi="Times New Roman"/>
+          <w:b w:val="0"/>
+          <w:sz w:val="26"/>
+        </w:rPr>
+        <w:t>3.6.1. Mã hóa dữ liệu</w:t>
+      </w:r>
+    </w:p>
+    <w:p>
+      <w:pPr>
+        <w:jc w:val="both"/>
+      </w:pPr>
+      <w:r>
+        <w:t>Dữ liệu truyền qua môi trường không dây có nguy cơ bị nghe lén. Nếu truyền JSON trực tiếp, người ngoài có thể đọc được nội dung như nhiệt độ, độ ẩm, vị trí GPS hoặc sequence number. Vì vậy, dữ liệu cần được mã hóa trước khi gửi.</w:t>
+      </w:r>
+    </w:p>
+    <w:p>
+      <w:pPr>
+        <w:jc w:val="both"/>
+      </w:pPr>
+      <w:r>
+        <w:t>AES là thuật toán mã hóa đối xứng được sử dụng rộng rãi. AES-128 sử dụng khóa 128 bit, tương ứng 16 byte. Chế độ CBC sử dụng IV để làm cho quá trình mã hóa an toàn hơn so với việc mã hóa từng khối độc lập.</w:t>
+      </w:r>
+    </w:p>
+    <w:p>
+      <w:pPr>
+        <w:jc w:val="both"/>
+      </w:pPr>
+      <w:r>
+        <w:t>Trong hệ thống, AES-128-CBC được lựa chọn vì:</w:t>
+      </w:r>
+    </w:p>
+    <w:p>
+      <w:pPr>
+        <w:pStyle w:val="ListBullet"/>
+        <w:spacing w:after="40" w:line="300" w:lineRule="auto"/>
+        <w:ind w:left="397" w:hanging="170"/>
+      </w:pPr>
+      <w:r>
+        <w:t>Có độ bảo mật phù hợp với mô hình thử nghiệm.</w:t>
+      </w:r>
+    </w:p>
+    <w:p>
+      <w:pPr>
+        <w:pStyle w:val="ListBullet"/>
+        <w:spacing w:after="40" w:line="300" w:lineRule="auto"/>
+        <w:ind w:left="397" w:hanging="170"/>
+      </w:pPr>
+      <w:r>
+        <w:t>Có thể triển khai trên ESP32.</w:t>
+      </w:r>
+    </w:p>
+    <w:p>
+      <w:pPr>
+        <w:pStyle w:val="ListBullet"/>
+        <w:spacing w:after="40" w:line="300" w:lineRule="auto"/>
+        <w:ind w:left="397" w:hanging="170"/>
+      </w:pPr>
+      <w:r>
+        <w:t>Phù hợp với dữ liệu dạng JSON có kích thước nhỏ.</w:t>
+      </w:r>
+    </w:p>
+    <w:p>
+      <w:pPr>
+        <w:pStyle w:val="ListBullet"/>
+        <w:spacing w:after="40" w:line="300" w:lineRule="auto"/>
+        <w:ind w:left="397" w:hanging="170"/>
+      </w:pPr>
+      <w:r>
+        <w:t>Server có thể giải mã dễ dàng bằng cùng khóa bí mật.</w:t>
+      </w:r>
+    </w:p>
+    <w:p>
+      <w:pPr>
+        <w:pStyle w:val="ListBullet"/>
+        <w:spacing w:after="40" w:line="300" w:lineRule="auto"/>
+        <w:ind w:left="397" w:hanging="170"/>
+      </w:pPr>
+      <w:r>
+        <w:t>Có thể kết hợp với IV để tránh cùng plaintext tạo cùng ciphertext.</w:t>
+      </w:r>
+    </w:p>
+    <w:p>
+      <w:pPr>
+        <w:pStyle w:val="Heading3"/>
+      </w:pPr>
+    </w:p>
+    <w:p>
+      <w:pPr>
+        <w:jc w:val="both"/>
+      </w:pPr>
+      <w:r>
+        <w:t>Dữ liệu đầu vào là chuỗi JSON chứa dữ liệu cảm biến, GPS, Gateway và sequence number.</w:t>
+      </w:r>
+    </w:p>
+    <w:p>
+      <w:pPr>
+        <w:jc w:val="both"/>
+      </w:pPr>
+      <w:r>
+        <w:t>Ví dụ:</w:t>
+      </w:r>
+    </w:p>
+    <w:p>
+      <w:pPr>
+        <w:pStyle w:val="CodeBlock"/>
+        <w:keepLines/>
+      </w:pPr>
+      <w:r>
+        <w:t>{ "id": "Xi_01", "t": 28.5, "h": 65.2, "gw": "Y_01", "seq": 1001</w:t>
+        <w:br/>
+        <w:t>}</w:t>
+      </w:r>
+      <w:r/>
+      <w:r/>
+      <w:r/>
+      <w:r/>
+      <w:r/>
+      <w:r/>
+    </w:p>
+    <w:p>
+      <w:pPr>
+        <w:jc w:val="both"/>
+      </w:pPr>
+      <w:r>
+        <w:t>Chuỗi JSON này được chuyển thành mảng byte trước khi mã hóa.</w:t>
+      </w:r>
+    </w:p>
+    <w:p>
+      <w:pPr>
+        <w:pStyle w:val="Heading3"/>
+      </w:pPr>
+    </w:p>
+    <w:p>
+      <w:pPr>
+        <w:pStyle w:val="Heading3"/>
+      </w:pPr>
+      <w:r>
+        <w:rPr>
+          <w:rFonts w:ascii="Times New Roman" w:hAnsi="Times New Roman"/>
+          <w:b w:val="0"/>
+          <w:sz w:val="26"/>
+        </w:rPr>
+        <w:t>3.6.2. Các thành phần mã hóa</w:t>
+      </w:r>
+    </w:p>
+    <w:p>
+      <w:pPr>
+        <w:jc w:val="both"/>
+      </w:pPr>
+      <w:r>
+        <w:t>AES-128 sử dụng khóa 16 byte.</w:t>
+      </w:r>
+    </w:p>
+    <w:p>
+      <w:pPr>
+        <w:jc w:val="both"/>
+      </w:pPr>
+      <w:r>
+        <w:t>Ở mức thiết kế:</w:t>
+      </w:r>
+    </w:p>
+    <w:p>
+      <w:pPr>
+        <w:pStyle w:val="CodeBlock"/>
+        <w:keepLines/>
+      </w:pPr>
+      <w:r>
+        <w:t>Key = 16 byte bí mật được cấu hình trước ở node Xi và Server</w:t>
+      </w:r>
+    </w:p>
+    <w:p>
+      <w:pPr>
+        <w:jc w:val="both"/>
+      </w:pPr>
+      <w:r>
+        <w:t>Khóa chỉ tồn tại ở node Xi và Server. Gateway không cần khóa vì Gateway không giải mã dữ liệu.</w:t>
+      </w:r>
+    </w:p>
+    <w:p>
+      <w:pPr>
+        <w:jc w:val="both"/>
+      </w:pPr>
+      <w:r>
+        <w:t>Trong báo cáo, không nên ghi khóa thật nếu hệ thống có sử dụng khóa cụ thể trong mã nguồn. Có thể mô tả khóa ở mức nguyên lý để tránh lộ thông tin bảo mật.</w:t>
+      </w:r>
+    </w:p>
+    <w:p>
+      <w:pPr>
+        <w:pStyle w:val="Heading3"/>
+      </w:pPr>
+    </w:p>
+    <w:p>
+      <w:pPr>
+        <w:jc w:val="both"/>
+      </w:pPr>
+      <w:r>
+        <w:t>AES-CBC xử lý dữ liệu theo từng khối 16 byte. Tuy nhiên, chuỗi JSON có thể có độ dài bất kỳ. Vì vậy, trước khi mã hóa cần thêm padding để độ dài plaintext trở thành bội số của 16.</w:t>
+      </w:r>
+    </w:p>
+    <w:p>
+      <w:pPr>
+        <w:jc w:val="both"/>
+      </w:pPr>
+      <w:r>
+        <w:t>Công thức:</w:t>
+      </w:r>
+    </w:p>
+    <w:p>
+      <w:pPr>
+        <w:pStyle w:val="CodeBlock"/>
+        <w:keepLines/>
+      </w:pPr>
+      <w:r>
+        <w:t>padding_length = 16 - (plaintext_length mod 16)</w:t>
+      </w:r>
+    </w:p>
+    <w:p>
+      <w:pPr>
+        <w:jc w:val="both"/>
+      </w:pPr>
+      <w:r>
+        <w:t>Ví dụ:</w:t>
+      </w:r>
+    </w:p>
+    <w:p>
+      <w:pPr>
+        <w:pStyle w:val="CodeBlock"/>
+        <w:keepLines/>
+      </w:pPr>
+      <w:r>
+        <w:t>plaintext_length = 45 byte</w:t>
+      </w:r>
+      <w:r>
+        <w:br/>
+        <w:t>45 mod 16 = 13</w:t>
+      </w:r>
+      <w:r>
+        <w:br/>
+        <w:t>padding_length = 16 - 13 = 3</w:t>
+      </w:r>
+    </w:p>
+    <w:p>
+      <w:pPr>
+        <w:jc w:val="both"/>
+      </w:pPr>
+      <w:r>
+        <w:t>Khi đó hệ thống thêm 3 byte padding.</w:t>
+      </w:r>
+    </w:p>
+    <w:p>
+      <w:pPr>
+        <w:jc w:val="both"/>
+      </w:pPr>
+      <w:r>
+        <w:t>Sau khi giải mã, Server dựa vào giá trị padding để loại bỏ phần dữ liệu thêm vào và khôi phục lại JSON ban đầu.</w:t>
+      </w:r>
+    </w:p>
+    <w:p>
+      <w:pPr>
+        <w:pStyle w:val="Heading3"/>
+      </w:pPr>
+    </w:p>
+    <w:p>
+      <w:pPr>
+        <w:jc w:val="both"/>
+      </w:pPr>
+      <w:r>
+        <w:t>IV là viết tắt của Initialization Vector. IV có độ dài 16 byte, bằng kích thước khối AES.</w:t>
+      </w:r>
+    </w:p>
+    <w:p>
+      <w:pPr>
+        <w:jc w:val="both"/>
+      </w:pPr>
+      <w:r>
+        <w:t>Trong hệ thống:</w:t>
+      </w:r>
+    </w:p>
+    <w:p>
+      <w:pPr>
+        <w:pStyle w:val="ListBullet"/>
+        <w:spacing w:after="40" w:line="300" w:lineRule="auto"/>
+        <w:ind w:left="397" w:hanging="170"/>
+      </w:pPr>
+      <w:r>
+        <w:t>Mỗi lần mã hóa tạo một IV mới.</w:t>
+      </w:r>
+    </w:p>
+    <w:p>
+      <w:pPr>
+        <w:pStyle w:val="ListBullet"/>
+        <w:spacing w:after="40" w:line="300" w:lineRule="auto"/>
+        <w:ind w:left="397" w:hanging="170"/>
+      </w:pPr>
+      <w:r>
+        <w:t>IV không cần giữ bí mật.</w:t>
+      </w:r>
+    </w:p>
+    <w:p>
+      <w:pPr>
+        <w:pStyle w:val="ListBullet"/>
+        <w:spacing w:after="40" w:line="300" w:lineRule="auto"/>
+        <w:ind w:left="397" w:hanging="170"/>
+      </w:pPr>
+      <w:r>
+        <w:t>IV được ghép vào đầu ciphertext.</w:t>
+      </w:r>
+    </w:p>
+    <w:p>
+      <w:pPr>
+        <w:pStyle w:val="ListBullet"/>
+        <w:spacing w:after="40" w:line="300" w:lineRule="auto"/>
+        <w:ind w:left="397" w:hanging="170"/>
+      </w:pPr>
+      <w:r>
+        <w:t>Server tách 16 byte đầu tiên để lấy IV.</w:t>
+      </w:r>
+    </w:p>
+    <w:p>
+      <w:pPr>
+        <w:pStyle w:val="ListBullet"/>
+        <w:spacing w:after="40" w:line="300" w:lineRule="auto"/>
+        <w:ind w:left="397" w:hanging="170"/>
+      </w:pPr>
+      <w:r>
+        <w:t>Phần còn lại là ciphertext.</w:t>
+      </w:r>
+    </w:p>
+    <w:p>
+      <w:pPr>
+        <w:jc w:val="both"/>
+      </w:pPr>
+      <w:r>
+        <w:t>Việc sử dụng IV giúp cùng một dữ liệu JSON khi mã hóa ở hai lần khác nhau có thể tạo ra ciphertext khác nhau.</w:t>
+      </w:r>
+    </w:p>
+    <w:p>
+      <w:pPr>
+        <w:pStyle w:val="Heading3"/>
+      </w:pPr>
+    </w:p>
+    <w:p>
+      <w:pPr>
+        <w:pStyle w:val="Heading3"/>
+      </w:pPr>
+      <w:r>
+        <w:rPr>
+          <w:rFonts w:ascii="Times New Roman" w:hAnsi="Times New Roman"/>
+          <w:b w:val="0"/>
+          <w:sz w:val="26"/>
+        </w:rPr>
+        <w:t>3.6.3. Cấu trúc payload sau mã hóa</w:t>
+      </w:r>
+    </w:p>
+    <w:p>
+      <w:pPr>
+        <w:jc w:val="both"/>
+      </w:pPr>
+      <w:r>
+        <w:t>Sau khi mã hóa, payload có cấu trúc:</w:t>
+      </w:r>
+    </w:p>
+    <w:p>
+      <w:pPr>
+        <w:pStyle w:val="CodeBlock"/>
+        <w:keepLines/>
+      </w:pPr>
+      <w:r>
+        <w:t>Payload byte = IV || Ciphertext</w:t>
+      </w:r>
+    </w:p>
+    <w:p>
+      <w:pPr>
+        <w:jc w:val="both"/>
+      </w:pPr>
+      <w:r>
+        <w:t>Trong đó:</w:t>
+      </w:r>
+    </w:p>
+    <w:p>
+      <w:pPr>
+        <w:spacing w:after="60"/>
+      </w:pPr>
+    </w:p>
+    <w:p>
+      <w:pPr>
+        <w:jc w:val="both"/>
+      </w:pPr>
+      <w:r>
+        <w:lastRenderedPageBreak/>
+        <w:t>Sau đó payload byte được chuyển thành chuỗi hex:</w:t>
+      </w:r>
+    </w:p>
+    <w:p>
+      <w:pPr>
+        <w:pStyle w:val="CodeBlock"/>
+        <w:keepLines/>
+      </w:pPr>
+      <w:r>
+        <w:t>Payload hex = HEX(IV || Ciphertext)</w:t>
+      </w:r>
+    </w:p>
+    <w:p>
+      <w:pPr>
+        <w:pStyle w:val="Heading3"/>
+      </w:pPr>
+      <w:r>
+        <w:rPr>
+          <w:rFonts w:ascii="Times New Roman" w:hAnsi="Times New Roman"/>
+          <w:b w:val="0"/>
+          <w:sz w:val="26"/>
+        </w:rPr>
+        <w:t>3.6.4. Lưu đồ mã hóa và giải mã</w:t>
+      </w:r>
+    </w:p>
+    <w:p>
+      <w:pPr>
+        <w:jc w:val="both"/>
+      </w:pPr>
+      <w:r>
+        <w:t>Ví dụ minh họa:</w:t>
+      </w:r>
+    </w:p>
+    <w:p>
+      <w:pPr>
+        <w:pStyle w:val="CodeBlock"/>
+        <w:keepLines/>
+      </w:pPr>
+      <w:r>
+        <w:t>IV: 16 byte đầu</w:t>
+        <w:br/>
+        <w:t>Ciphertext: các byte còn lại</w:t>
+        <w:br/>
+        <w:t>Payload: IV + Ciphertext</w:t>
+      </w:r>
+      <w:r/>
+      <w:r/>
+    </w:p>
+    <w:p>
+      <w:pPr>
+        <w:pStyle w:val="Heading3"/>
+      </w:pPr>
+    </w:p>
+    <w:p>
+      <w:pPr>
+        <w:pStyle w:val="CodeBlock"/>
+        <w:keepLines/>
+      </w:pPr>
+      <w:r>
+        <w:t>Dữ liệu cảm biến và GPS ↓</w:t>
+        <w:br/>
+        <w:t>Tạo JSON ↓</w:t>
+        <w:br/>
+        <w:t>Thêm id, gw và seq ↓</w:t>
+        <w:br/>
+        <w:t>Chuyển JSON thành byte ↓</w:t>
+        <w:br/>
+        <w:t>Tính padding ↓</w:t>
+        <w:br/>
+        <w:t>Thêm padding ↓</w:t>
+        <w:br/>
+        <w:t>Tạo IV 16 byte ↓</w:t>
+        <w:br/>
+        <w:t>Mã hóa AES-128-CBC ↓</w:t>
+        <w:br/>
+        <w:t>Ghép IV + ciphertext ↓</w:t>
+        <w:br/>
+        <w:t>Chuyển sang chuỗi hex ↓</w:t>
+        <w:br/>
+        <w:t>Gửi payload đến Gateway</w:t>
+      </w:r>
+      <w:r/>
+      <w:r/>
+      <w:r/>
+      <w:r/>
+      <w:r/>
+      <w:r/>
+      <w:r/>
+      <w:r/>
+      <w:r/>
+      <w:r/>
+      <w:r/>
+      <w:r/>
+      <w:r/>
+      <w:r/>
+      <w:r/>
+      <w:r/>
+      <w:r/>
+      <w:r/>
+      <w:r/>
+      <w:r/>
+    </w:p>
+    <w:p>
+      <w:pPr>
+        <w:pStyle w:val="Heading3"/>
+      </w:pPr>
+    </w:p>
+    <w:p>
+      <w:pPr>
+        <w:pStyle w:val="CodeBlock"/>
+        <w:keepLines/>
+      </w:pPr>
+      <w:r>
+        <w:t>Nhận payload hex ↓</w:t>
+        <w:br/>
+        <w:t>Chuyển hex thành byte ↓</w:t>
+        <w:br/>
+        <w:t>Tách 16 byte đầu làm IV ↓</w:t>
+        <w:br/>
+        <w:t>Lấy phần còn lại làm ciphertext ↓</w:t>
+        <w:br/>
+        <w:t>Giải mã AES-128-CBC ↓</w:t>
+        <w:br/>
+        <w:t>Loại bỏ padding ↓</w:t>
+        <w:br/>
+        <w:t>Khôi phục JSON plaintext ↓</w:t>
+        <w:br/>
+        <w:t>Kiểm tra dữ liệu</w:t>
+      </w:r>
+      <w:r/>
+      <w:r/>
+      <w:r/>
+      <w:r/>
+      <w:r/>
+      <w:r/>
+      <w:r/>
+      <w:r/>
+      <w:r/>
+      <w:r/>
+      <w:r/>
+      <w:r/>
+      <w:r/>
+      <w:r/>
+    </w:p>
+    <w:p>
+      <w:pPr>
+        <w:pStyle w:val="Heading2"/>
+      </w:pPr>
       <w:r>
         <w:rPr>
           <w:b/>
         </w:rPr>
-        <w:t>3.9. Lưu đồ hoạt động toàn bộ hệ thống</w:t>
+      </w:r>
+      <w:r>
+        <w:rPr>
+          <w:rFonts w:ascii="Times New Roman" w:hAnsi="Times New Roman"/>
+          <w:b/>
+          <w:sz w:val="26"/>
+        </w:rPr>
+        <w:t>3.7. Lưu đồ hoạt động của toàn bộ hệ thống</w:t>
       </w:r>
     </w:p>
     <w:p>
@@ -17148,7 +17391,14 @@
         <w:rPr>
           <w:b/>
         </w:rPr>
-        <w:t>3.10. Kết luận chương</w:t>
+      </w:r>
+      <w:r>
+        <w:rPr>
+          <w:rFonts w:ascii="Times New Roman" w:hAnsi="Times New Roman"/>
+          <w:b/>
+          <w:sz w:val="26"/>
+        </w:rPr>
+        <w:t>3.8. Kết luận chương</w:t>
       </w:r>
     </w:p>
     <w:p>

</xml_diff>